<commit_message>
docs: add LaTeX preprint publication package
</commit_message>
<xml_diff>
--- a/preprint/Plato-Bio-bioRxiv-preprint.docx
+++ b/preprint/Plato-Bio-bioRxiv-preprint.docx
@@ -680,7 +680,7 @@
           <w:color w:val="181B1F"/>
           <w:sz w:val="22"/>
         </w:rPr>
-        <w:t>The complete Python suite produced no failures or errors. The targeted biology-domain, genomics-adapter, evidence/citation, and adversarial-safety suites also produced no failures or errors. Some full-suite tests were skipped because optional live dependencies, provider credentials, or a platform-specific path condition were unavailable. Figure 4 and Table 1 report exact counts from the machine-readable validation report generated for this revision.</w:t>
+        <w:t>The complete Python suite produced no failures or errors. The targeted biology-domain, genomics-adapter, evidence/citation, and adversarial-safety suites also produced no failures or errors. Some full-suite tests were skipped because optional live dependencies, provider credentials, or a platform-specific path condition were unavailable. Figure 2 and Table 1 report exact counts from the machine-readable validation report generated for this revision.</w:t>
       </w:r>
     </w:p>
     <w:p>
@@ -692,7 +692,7 @@
         <w:drawing>
           <wp:inline xmlns:a="http://schemas.openxmlformats.org/drawingml/2006/main" xmlns:pic="http://schemas.openxmlformats.org/drawingml/2006/picture">
             <wp:extent cx="5715000" cy="3150577"/>
-            <wp:docPr id="2" name="Picture 2" descr="Figure 4. Passed and skipped tests in targeted validation suites." title="Figure 4"/>
+            <wp:docPr id="2" name="Picture 2" descr="Figure 2. Passed and skipped tests in targeted validation suites." title="Figure 2"/>
             <wp:cNvGraphicFramePr>
               <a:graphicFrameLocks noChangeAspect="1"/>
             </wp:cNvGraphicFramePr>
@@ -733,7 +733,7 @@
           <w:color w:val="181B1F"/>
           <w:sz w:val="22"/>
         </w:rPr>
-        <w:t>Figure 4. Passed and skipped tests in targeted validation suites.</w:t>
+        <w:t>Figure 2. Passed and skipped tests in targeted validation suites.</w:t>
       </w:r>
     </w:p>
     <w:tbl>
@@ -3202,7 +3202,7 @@
         <w:drawing>
           <wp:inline xmlns:a="http://schemas.openxmlformats.org/drawingml/2006/main" xmlns:pic="http://schemas.openxmlformats.org/drawingml/2006/picture">
             <wp:extent cx="5715000" cy="3333750"/>
-            <wp:docPr id="3" name="Picture 3" descr="Figure 2. Cα RMSD for the three declared globin targets." title="Figure 2"/>
+            <wp:docPr id="3" name="Picture 3" descr="Figure 3. Cα RMSD for the three declared globin targets." title="Figure 3"/>
             <wp:cNvGraphicFramePr>
               <a:graphicFrameLocks noChangeAspect="1"/>
             </wp:cNvGraphicFramePr>
@@ -3243,7 +3243,7 @@
           <w:color w:val="181B1F"/>
           <w:sz w:val="22"/>
         </w:rPr>
-        <w:t>Figure 2. Cα RMSD for the three declared globin targets.</w:t>
+        <w:t>Figure 3. Cα RMSD for the three declared globin targets.</w:t>
       </w:r>
     </w:p>
     <w:p>
@@ -3265,7 +3265,7 @@
         <w:drawing>
           <wp:inline xmlns:a="http://schemas.openxmlformats.org/drawingml/2006/main" xmlns:pic="http://schemas.openxmlformats.org/drawingml/2006/picture">
             <wp:extent cx="5715000" cy="2032000"/>
-            <wp:docPr id="4" name="Picture 4" descr="Figure 3. Residue-level pLDDT versus aligned Cα error." title="Figure 3"/>
+            <wp:docPr id="4" name="Picture 4" descr="Figure 4. Residue-level pLDDT versus aligned Cα error." title="Figure 4"/>
             <wp:cNvGraphicFramePr>
               <a:graphicFrameLocks noChangeAspect="1"/>
             </wp:cNvGraphicFramePr>
@@ -3306,7 +3306,7 @@
           <w:color w:val="181B1F"/>
           <w:sz w:val="22"/>
         </w:rPr>
-        <w:t>Figure 3. Residue-level pLDDT versus aligned Cα error.</w:t>
+        <w:t>Figure 4. Residue-level pLDDT versus aligned Cα error.</w:t>
       </w:r>
     </w:p>
     <w:p>
@@ -3324,7 +3324,7 @@
           <w:color w:val="181B1F"/>
           <w:sz w:val="22"/>
         </w:rPr>
-        <w:t>The case-study output contains the two experimental PDB files, three AlphaFold models, source and output hashes, a target-level CSV, a 433-row residue-level CSV, and a JSON manifest. Re-running the analysis reconstructs all summary values and Figures 2–3. A second script reconstructs Figures 1 and 4 from the repository architecture and validation JSON. The paper source, editable Word manuscript, and submission PDF are generated from the same controlled source bundle.</w:t>
+        <w:t>The case-study output contains the two experimental PDB files, three AlphaFold models, source and output hashes, a target-level CSV, a 433-row residue-level CSV, and a JSON manifest. Re-running the analysis reconstructs all summary values and Figures 3–4. A second script reconstructs Figures 1 and 2 from the repository architecture and validation JSON. The paper source, editable Word manuscript, and submission PDF are generated from the same controlled source bundle.</w:t>
       </w:r>
     </w:p>
     <w:p>
@@ -4151,7 +4151,26 @@
           <w:color w:val="181B1F"/>
           <w:sz w:val="22"/>
         </w:rPr>
-        <w:t>Figure 2. AlphaFold-to-experiment agreement in the declared globin panel.</w:t>
+        <w:t>Figure 2. Targeted deterministic validation suites.</w:t>
+      </w:r>
+      <w:r>
+        <w:rPr>
+          <w:rFonts w:ascii="Times New Roman" w:hAnsi="Times New Roman"/>
+          <w:color w:val="181B1F"/>
+          <w:sz w:val="22"/>
+        </w:rPr>
+        <w:t xml:space="preserve"> Bars show passing tests in control-specific subsets; gray denotes skipped tests. Suites overlap with the full repository suite and should not be summed.</w:t>
+      </w:r>
+    </w:p>
+    <w:p>
+      <w:r>
+        <w:rPr>
+          <w:rFonts w:ascii="Times New Roman" w:hAnsi="Times New Roman"/>
+          <w:b/>
+          <w:color w:val="181B1F"/>
+          <w:sz w:val="22"/>
+        </w:rPr>
+        <w:t>Figure 3. AlphaFold-to-experiment agreement in the declared globin panel.</w:t>
       </w:r>
       <w:r>
         <w:rPr>
@@ -4170,7 +4189,7 @@
           <w:color w:val="181B1F"/>
           <w:sz w:val="22"/>
         </w:rPr>
-        <w:t>Figure 3. Residue confidence versus aligned coordinate error.</w:t>
+        <w:t>Figure 4. Residue confidence versus aligned coordinate error.</w:t>
       </w:r>
       <w:r>
         <w:rPr>
@@ -4179,25 +4198,6 @@
           <w:sz w:val="22"/>
         </w:rPr>
         <w:t xml:space="preserve"> Each point is one matched residue. pLDDT is read from the AlphaFold PDB B-factor field; error is the Euclidean Cα distance after target-level superposition.</w:t>
-      </w:r>
-    </w:p>
-    <w:p>
-      <w:r>
-        <w:rPr>
-          <w:rFonts w:ascii="Times New Roman" w:hAnsi="Times New Roman"/>
-          <w:b/>
-          <w:color w:val="181B1F"/>
-          <w:sz w:val="22"/>
-        </w:rPr>
-        <w:t>Figure 4. Targeted deterministic validation suites.</w:t>
-      </w:r>
-      <w:r>
-        <w:rPr>
-          <w:rFonts w:ascii="Times New Roman" w:hAnsi="Times New Roman"/>
-          <w:color w:val="181B1F"/>
-          <w:sz w:val="22"/>
-        </w:rPr>
-        <w:t xml:space="preserve"> Bars show passing tests in control-specific subsets; gray denotes skipped tests. Suites overlap with the full repository suite and should not be summed.</w:t>
       </w:r>
     </w:p>
     <w:sectPr>

</xml_diff>

<commit_message>
feat: add biological novelty benchmark revision
</commit_message>
<xml_diff>
--- a/preprint/Plato-Bio-bioRxiv-preprint.docx
+++ b/preprint/Plato-Bio-bioRxiv-preprint.docx
@@ -20,7 +20,7 @@
           <w:color w:val="181B1F"/>
           <w:sz w:val="36"/>
         </w:rPr>
-        <w:t>Plato-Bio: a verification-first multi-agent research workflow with a reproducible structural-biology case study</w:t>
+        <w:t>Plato-Bio: verification-first biological novelty screening with temporal rediscovery and structural benchmarks</w:t>
       </w:r>
     </w:p>
     <w:p>
@@ -146,7 +146,7 @@
           <w:color w:val="181B1F"/>
           <w:sz w:val="22"/>
         </w:rPr>
-        <w:t xml:space="preserve"> scientific agents; bioinformatics; reproducibility; citation validation; evidence provenance; AlphaFold; structural biology</w:t>
+        <w:t xml:space="preserve"> scientific agents; bioinformatics; biological novelty; literature-based discovery; temporal rediscovery; reproducibility; AlphaFold</w:t>
       </w:r>
     </w:p>
     <w:p>
@@ -174,7 +174,17 @@
           <w:color w:val="181B1F"/>
           <w:sz w:val="22"/>
         </w:rPr>
-        <w:t>To demonstrate a fully reproducible biological computation independent of paid model providers, we compared AlphaFold Database models with experimental structures for human hemoglobin α, hemoglobin β, and myoglobin. Sequence-aware Cα matching followed by Kabsch superposition yielded RMSDs of 0.270, 0.520, and 0.501 Å, respectively. At least 99.3% of matched residues were within 2 Å of the experimental coordinates, and pLDDT showed modest positive rank correlation with lower residue-level error (Spearman ρ=0.242–0.353; all nominal P≤0.0039). The study establishes a transparent validation baseline and a submission artifact, but does not demonstrate autonomous discovery, improved manuscript quality, or independent peer review. Plato-Bio should therefore be used as a supervised research instrument whose claims remain the responsibility of human authors.</w:t>
+        <w:t>We then added a leakage-controlled temporal rediscovery component that requires two independent pre-cutoff A–B and B–C literature records, rejects direct pre-cutoff A–C prior art, preserves provenance, quarantines prompt-injection signals, and can abstain when evidence is insufficient. In a five-task synthetic engineering smoke, the evidence-aware condition ranked every planted target first, whereas frequency ranking placed no target first; these synthetic results validate plumbing only. In a separately frozen historical pilot, six PubMed records published before 1986 supported a blood-viscosity bridge between Raynaud phenomenon and fish oil. The evidence-aware and bridge-only conditions ranked the relation later evaluated in a 1989 controlled study first; TF–IDF ranked it second and frequency third. Because this is one manually curated historical task, it is evidence of retrospective ranking behavior, not prospective discovery.</w:t>
+      </w:r>
+    </w:p>
+    <w:p>
+      <w:r>
+        <w:rPr>
+          <w:rFonts w:ascii="Times New Roman" w:hAnsi="Times New Roman"/>
+          <w:color w:val="181B1F"/>
+          <w:sz w:val="22"/>
+        </w:rPr>
+        <w:t>We also expanded the structural panel from three globins to 15 human proteins spanning compact, multi-domain, conformationally variable, and solution-NMR examples. Eleven of 15 targets had high-confidence-core Cα RMSD below 1 Å (median 0.501 Å), while KRAS, TP53, estrogen receptor α, and SUMO1 exceeded 2 Å. Confidence-masked alignment reduced the SUMO1 discrepancy from 16.61 Å over the whole chain to 2.58 Å over 74 high-confidence residues, demonstrating why flexible regions and experimental modality must be separated from candidate novelty. The resulting 27 discrepancy regions are explicitly labeled unvalidated hypotheses. These results establish transparent benchmark and screening baselines, but not autonomous discovery, independent peer review, or biological truth.</w:t>
       </w:r>
     </w:p>
     <w:p>
@@ -222,7 +232,7 @@
           <w:color w:val="181B1F"/>
           <w:sz w:val="22"/>
         </w:rPr>
-        <w:t>We make four contributions. First, we describe a biology-routed workflow in which literature sources, keyword extraction, execution defaults, and journal choices are represented by an explicit domain profile. Second, we document evidence and safety controls that create inspectable artifacts: citation-validation reports, claim/evidence matrices, scientific-consistency checks, and run manifests. Third, we repair and regression-test three defects that would otherwise distort evaluation measurements. Fourth, we provide a deterministic AlphaFold-to-experiment benchmark with source URLs, SHA-256 hashes, residue-level data, summary statistics, and figures. Our central claim is deliberately narrow: the current repository implements and tests these software contracts and reproduces this case study. We do not infer autonomous scientific validity from test counts or from the case study.</w:t>
+        <w:t>We make five contributions. First, we describe a biology-routed workflow in which literature sources, keyword extraction, execution defaults, and journal choices are represented by an explicit domain profile. Second, we document evidence and safety controls that create inspectable artifacts: citation-validation reports, claim/evidence matrices, scientific-consistency checks, and run manifests. Third, we repair and regression-test measurement defects that would otherwise distort evaluation. Fourth, we implement a frozen temporal rediscovery benchmark with explicit cutoffs, evidence bridges, abstention, baselines, and task-level uncertainty, aligning the evaluation design with ScienceAgentBench, BioDSA-1K, and BixBench [11–13]. Fifth, we expand the deterministic AlphaFold-to-experiment screen to 15 targets with source hashes, confidence-masked and whole-chain statistics, residue-level data, and hypothesis-only discrepancy regions. Our central claim remains narrow: the repository implements and tests these contracts and reproduces these benchmark cases. We do not infer autonomous scientific validity from them.</w:t>
       </w:r>
     </w:p>
     <w:p>
@@ -248,7 +258,23 @@
           <w:color w:val="181B1F"/>
           <w:sz w:val="22"/>
         </w:rPr>
-        <w:t>We conducted a source-level architecture audit, repaired measurement defects whose behavior contradicted documented contracts, ran deterministic validation suites, and executed a preregistered-in-code structural comparison panel. The panel was declared as a constant before results were inspected and contained three UniProt/PDB mappings: P69905 to PDB 1A3N chain A, P68871 to PDB 1A3N chain B, and P02144 to PDB 3RGK chain A. The analysis did not use an LLM, select targets after observing results, or perform a hypothesis search.</w:t>
+        <w:t xml:space="preserve">We conducted a source-level architecture audit, repaired measurement defects whose behavior contradicted documented contracts, ran deterministic validation suites, and executed two distinct evaluation lanes. The first is a frozen temporal rediscovery benchmark for literature-derived candidate ranking. The second is an AlphaFold-to-experiment structure screen. The original three-globin panel was retained, and a 15-target expansion was declared in </w:t>
+      </w:r>
+      <w:r>
+        <w:rPr>
+          <w:rFonts w:ascii="Courier New" w:hAnsi="Courier New"/>
+          <w:color w:val="181B1F"/>
+          <w:sz w:val="19"/>
+        </w:rPr>
+        <w:t>preprint/experiments/diverse_structure_panel.json</w:t>
+      </w:r>
+      <w:r>
+        <w:rPr>
+          <w:rFonts w:ascii="Times New Roman" w:hAnsi="Times New Roman"/>
+          <w:color w:val="181B1F"/>
+          <w:sz w:val="22"/>
+        </w:rPr>
+        <w:t xml:space="preserve"> before that run. Neither benchmark used an LLM or selected successful outputs after observing results.</w:t>
       </w:r>
     </w:p>
     <w:p>
@@ -570,6 +596,62 @@
         <w:pStyle w:val="Heading2"/>
       </w:pPr>
       <w:r>
+        <w:t>Benchmark alignment and external task catalog</w:t>
+      </w:r>
+    </w:p>
+    <w:p>
+      <w:r>
+        <w:rPr>
+          <w:rFonts w:ascii="Times New Roman" w:hAnsi="Times New Roman"/>
+          <w:color w:val="181B1F"/>
+          <w:sz w:val="22"/>
+        </w:rPr>
+        <w:t>We used current scientific-agent benchmarks as design constraints rather than treating generic text similarity as an efficacy measure. ScienceAgentBench uses 102 executable tasks from 44 peer-reviewed publications and expert validation; BioDSA-1K separates hypothesis decisions, evidence alignment, reasoning, executability, and non-verifiable cases; and BixBench emphasizes long, multi-step biological analysis with open-answer interpretation [11–13]. Plato-Bio therefore reports executable or machine-readable artifacts, explicit baselines and ablations, abstention, provenance, task-level metrics, and failure boundaries. We also pinned and hash-verified the public CompBioBench v1 task catalog. Its 100 tasks span epigenomics, genomics, machine learning, population genetics, single-cell, spatial, structure, and transcriptomics. This release imports task metadata only; it does not claim CompBioBench performance because the corresponding datasets and agent runs were not executed.</w:t>
+      </w:r>
+    </w:p>
+    <w:p>
+      <w:pPr>
+        <w:pStyle w:val="Heading2"/>
+      </w:pPr>
+      <w:r>
+        <w:t>Temporal rediscovery and evidence-bridge ranking</w:t>
+      </w:r>
+    </w:p>
+    <w:p>
+      <w:r>
+        <w:rPr>
+          <w:rFonts w:ascii="Times New Roman" w:hAnsi="Times New Roman"/>
+          <w:color w:val="181B1F"/>
+          <w:sz w:val="22"/>
+        </w:rPr>
+        <w:t>Each temporal task freezes an exact cutoff date, anchor concept A, candidate concepts C, a later validation publication, and pre-cutoff records with publication dates, identifiers, URLs, and manually declared concepts. Records dated on or after the cutoff cause a hard failure; missing dates also fail. Duplicate DOI/PMID records are collapsed, and records with prompt-injection signals are quarantined. A candidate can be labeled a temporally novel candidate only when no pre-cutoff record directly joins A and C and at least two different records form an A–B and B–C path. Direct A–C records are labeled known pre-cutoff; candidates without a bridge abstain as unsupported. These labels describe corpus state and do not assert biological truth.</w:t>
+      </w:r>
+    </w:p>
+    <w:p>
+      <w:r>
+        <w:rPr>
+          <w:rFonts w:ascii="Times New Roman" w:hAnsi="Times New Roman"/>
+          <w:color w:val="181B1F"/>
+          <w:sz w:val="22"/>
+        </w:rPr>
+        <w:t>Candidates were ranked under four declared conditions: corpus frequency, TF–IDF relevance, unweighted A–B/B–C bridge support, and an evidence-aware score. The evidence-aware condition combines normalized independent bridge pairs (0.45), TF–IDF relevance (0.25), source diversity (0.20), and provenance completeness (0.10), with a penalty of 1.0 for direct prior art. Primary endpoints were mean reciprocal rank, Recall@1, Recall@10, and false-novelty rate on known controls. Ninety-five percent intervals were computed with 10,000 task-level bootstrap resamples. Intervals from the one-task historical pilot are degenerate and are not population uncertainty estimates.</w:t>
+      </w:r>
+    </w:p>
+    <w:p>
+      <w:r>
+        <w:rPr>
+          <w:rFonts w:ascii="Times New Roman" w:hAnsi="Times New Roman"/>
+          <w:color w:val="181B1F"/>
+          <w:sz w:val="22"/>
+        </w:rPr>
+        <w:t>The engineering smoke contains five explicitly synthetic tasks and tests only measurement behavior. The historical pilot freezes six pre-1986 PubMed records plus a declared negative-control record. The bridge joins Raynaud phenomenon to blood viscosity through a 1976 report and fish oil to lower blood viscosity through a 1985 report [14,15]. The held-out validation is a 1989 double-blind controlled study of fish-oil supplementation in Raynaud phenomenon [16]. Nifedipine and prostaglandin E1 were included as known pre-cutoff controls because direct Raynaud-treatment records were already present. Record text in the fixture is concise curator-written paraphrase; PubMed identifiers and source URLs preserve traceability.</w:t>
+      </w:r>
+    </w:p>
+    <w:p>
+      <w:pPr>
+        <w:pStyle w:val="Heading2"/>
+      </w:pPr>
+      <w:r>
         <w:t>Structural-biology case study</w:t>
       </w:r>
     </w:p>
@@ -616,7 +698,33 @@
           <w:color w:val="181B1F"/>
           <w:sz w:val="22"/>
         </w:rPr>
-        <w:t>Predicted Cα coordinates were superposed on experimental coordinates using the Kabsch least-squares rotation [8]. We calculated global Cα RMSD, median residue error, fractions within 2 and 5 Å, mean pLDDT, and Spearman rank correlation between pLDDT and negative residue error. A positive correlation therefore means that greater model confidence is associated with lower structural discrepancy. The Kabsch implementation was regression-tested against a synthetic rigid rotation and translation. The analysis script, raw coordinate files, residue-level CSV, target summary, source hashes, and figures are included with this preprint.</w:t>
+        <w:t>Predicted Cα coordinates were superposed on experimental coordinates using the Kabsch least-squares rotation [8]. We calculated whole-chain Cα RMSD and a predeclared confidence-masked RMSD using matched AlphaFold residues with pLDDT≥70. The rigid transform fitted to that high-confidence core was then applied to all matched residues before residue-level discrepancy screening. Moving-block residue bootstrap intervals used 2,000 resamples, blocks of 10 contiguous residues, and a fixed seed; because residues are not independent biological replicates, these intervals are descriptive. We also calculated median residue error, fractions within 2 and 5 Å, mean pLDDT, and Spearman rank correlation between pLDDT and negative core-aligned residue error.</w:t>
+      </w:r>
+    </w:p>
+    <w:p>
+      <w:r>
+        <w:rPr>
+          <w:rFonts w:ascii="Times New Roman" w:hAnsi="Times New Roman"/>
+          <w:color w:val="181B1F"/>
+          <w:sz w:val="22"/>
+        </w:rPr>
+        <w:t xml:space="preserve">The expanded panel contains 15 human proteins and 2,688 matched residues. Experimental-method and resolution fields were parsed from PDB headers. A discrepancy region required pLDDT≥90 and core-aligned Cα error≥2 Å; adjacent qualifying residues were grouped. Every output is labeled </w:t>
+      </w:r>
+      <w:r>
+        <w:rPr>
+          <w:rFonts w:ascii="Courier New" w:hAnsi="Courier New"/>
+          <w:color w:val="181B1F"/>
+          <w:sz w:val="19"/>
+        </w:rPr>
+        <w:t>novelty_status=not_established</w:t>
+      </w:r>
+      <w:r>
+        <w:rPr>
+          <w:rFonts w:ascii="Times New Roman" w:hAnsi="Times New Roman"/>
+          <w:color w:val="181B1F"/>
+          <w:sz w:val="22"/>
+        </w:rPr>
+        <w:t xml:space="preserve"> and requires review of constructs, mutations, ligands, oligomeric state, alternative structures, and experimental conditions before independent validation. The Kabsch and core-transform implementations were regression-tested against synthetic rigid transformations. The analysis script, panel declaration, raw coordinate files, residue-level CSV, target summaries, source hashes, candidate table, and figures are included with this preprint.</w:t>
       </w:r>
     </w:p>
     <w:p>
@@ -1728,7 +1836,7 @@
                 <w:color w:val="181B1F"/>
                 <w:sz w:val="16"/>
               </w:rPr>
-              <w:t>918</w:t>
+              <w:t>937</w:t>
             </w:r>
           </w:p>
         </w:tc>
@@ -1763,7 +1871,7 @@
                 <w:color w:val="181B1F"/>
                 <w:sz w:val="16"/>
               </w:rPr>
-              <w:t>912</w:t>
+              <w:t>931</w:t>
             </w:r>
           </w:p>
         </w:tc>
@@ -1859,7 +1967,7 @@
         <w:pStyle w:val="Heading2"/>
       </w:pPr>
       <w:r>
-        <w:t>AlphaFold-to-experiment structural agreement</w:t>
+        <w:t>Temporal rediscovery benchmark</w:t>
       </w:r>
     </w:p>
     <w:p>
@@ -1869,7 +1977,1193 @@
           <w:color w:val="181B1F"/>
           <w:sz w:val="22"/>
         </w:rPr>
-        <w:t>All three targets produced high sequence coverage and sub-ångström Cα RMSD after sequence-aware superposition (Table 2). Hemoglobin α had the lowest RMSD (0.270 Å), followed by myoglobin (0.501 Å) and hemoglobin β (0.520 Å). All matched α and β hemoglobin residues were within 2 Å of their experimental coordinates. For myoglobin, 146 of 147 matched residues (99.3%) were within 2 Å and all were within 5 Å.</w:t>
+        <w:t>The synthetic engineering smoke behaved as intended. Across five tasks, frequency ranking yielded MRR 0.500 and Recall@1 0.000, while TF–IDF, bridge-only, and evidence-aware conditions each yielded MRR 1.000 and Recall@1 1.000. Recall@10 was 1.000 and the false-novelty rate on declared known controls was 0.000 under every condition. Because target evidence and decoys were constructed to test the implementation, these values are regression evidence, not biological efficacy.</w:t>
+      </w:r>
+    </w:p>
+    <w:p>
+      <w:r>
+        <w:rPr>
+          <w:rFonts w:ascii="Times New Roman" w:hAnsi="Times New Roman"/>
+          <w:color w:val="181B1F"/>
+          <w:sz w:val="22"/>
+        </w:rPr>
+        <w:t>The historical pilot produced a harder ranking (Table 2). Frequency ranked the held-out fish-oil/Raynaud relation third (reciprocal rank 0.333), TF–IDF ranked it second (0.500), and both bridge-only and evidence-aware conditions ranked it first (1.000). The candidate had one independent evidence path through blood viscosity, no direct pre-1986 prior record in the frozen corpus, complete URL/date provenance, and validation PMID 2536517 published in 1989. The three direct Raynaud–nifedipine records and one Raynaud–prostaglandin E1 record were correctly labeled known pre-cutoff, so none contributed a false-novelty error. The result supports the value of an explicit evidence bridge on this historical case; it does not estimate performance across biomedical discovery.</w:t>
+      </w:r>
+    </w:p>
+    <w:tbl>
+      <w:tblPr>
+        <w:tblStyle w:val="TableGrid"/>
+        <w:tblW w:type="dxa" w:w="9792"/>
+        <w:jc w:val="left"/>
+        <w:tblLayout w:type="fixed"/>
+        <w:tblLook w:firstColumn="1" w:firstRow="1" w:lastColumn="0" w:lastRow="0" w:noHBand="0" w:noVBand="1" w:val="04A0"/>
+        <w:tblInd w:type="dxa" w:w="110"/>
+      </w:tblPr>
+      <w:tblGrid>
+        <w:gridCol w:w="2247"/>
+        <w:gridCol w:w="963"/>
+        <w:gridCol w:w="963"/>
+        <w:gridCol w:w="1284"/>
+        <w:gridCol w:w="1445"/>
+        <w:gridCol w:w="2890"/>
+      </w:tblGrid>
+      <w:tr>
+        <w:trPr>
+          <w:trHeight w:hRule="atLeast"/>
+          <w:tblHeader w:val="true"/>
+        </w:trPr>
+        <w:tc>
+          <w:tcPr>
+            <w:tcW w:type="dxa" w:w="2247"/>
+            <w:vAlign w:val="center"/>
+            <w:shd w:fill="E8EEF5"/>
+            <w:tcBorders>
+              <w:top w:val="single" w:sz="4" w:color="B9C2CC"/>
+              <w:left w:val="single" w:sz="4" w:color="B9C2CC"/>
+              <w:bottom w:val="single" w:sz="4" w:color="B9C2CC"/>
+              <w:right w:val="single" w:sz="4" w:color="B9C2CC"/>
+              <w:insideH w:val="single" w:sz="4" w:color="B9C2CC"/>
+              <w:insideV w:val="single" w:sz="4" w:color="B9C2CC"/>
+            </w:tcBorders>
+            <w:tcMar>
+              <w:top w:w="90" w:type="dxa"/>
+              <w:bottom w:w="90" w:type="dxa"/>
+              <w:start w:w="110" w:type="dxa"/>
+              <w:end w:w="110" w:type="dxa"/>
+            </w:tcMar>
+          </w:tcPr>
+          <w:p>
+            <w:pPr>
+              <w:spacing w:before="0" w:after="0" w:line="252" w:lineRule="auto"/>
+              <w:jc w:val="left"/>
+            </w:pPr>
+            <w:r>
+              <w:rPr>
+                <w:rFonts w:ascii="Arial" w:hAnsi="Arial"/>
+                <w:b/>
+                <w:color w:val="181B1F"/>
+                <w:sz w:val="16"/>
+              </w:rPr>
+              <w:t>Condition</w:t>
+            </w:r>
+          </w:p>
+        </w:tc>
+        <w:tc>
+          <w:tcPr>
+            <w:tcW w:type="dxa" w:w="963"/>
+            <w:vAlign w:val="center"/>
+            <w:shd w:fill="E8EEF5"/>
+            <w:tcBorders>
+              <w:top w:val="single" w:sz="4" w:color="B9C2CC"/>
+              <w:left w:val="single" w:sz="4" w:color="B9C2CC"/>
+              <w:bottom w:val="single" w:sz="4" w:color="B9C2CC"/>
+              <w:right w:val="single" w:sz="4" w:color="B9C2CC"/>
+              <w:insideH w:val="single" w:sz="4" w:color="B9C2CC"/>
+              <w:insideV w:val="single" w:sz="4" w:color="B9C2CC"/>
+            </w:tcBorders>
+            <w:tcMar>
+              <w:top w:w="90" w:type="dxa"/>
+              <w:bottom w:w="90" w:type="dxa"/>
+              <w:start w:w="110" w:type="dxa"/>
+              <w:end w:w="110" w:type="dxa"/>
+            </w:tcMar>
+          </w:tcPr>
+          <w:p>
+            <w:pPr>
+              <w:spacing w:before="0" w:after="0" w:line="252" w:lineRule="auto"/>
+              <w:jc w:val="left"/>
+            </w:pPr>
+            <w:r>
+              <w:rPr>
+                <w:rFonts w:ascii="Arial" w:hAnsi="Arial"/>
+                <w:b/>
+                <w:color w:val="181B1F"/>
+                <w:sz w:val="16"/>
+              </w:rPr>
+              <w:t>Tasks</w:t>
+            </w:r>
+          </w:p>
+        </w:tc>
+        <w:tc>
+          <w:tcPr>
+            <w:tcW w:type="dxa" w:w="963"/>
+            <w:vAlign w:val="center"/>
+            <w:shd w:fill="E8EEF5"/>
+            <w:tcBorders>
+              <w:top w:val="single" w:sz="4" w:color="B9C2CC"/>
+              <w:left w:val="single" w:sz="4" w:color="B9C2CC"/>
+              <w:bottom w:val="single" w:sz="4" w:color="B9C2CC"/>
+              <w:right w:val="single" w:sz="4" w:color="B9C2CC"/>
+              <w:insideH w:val="single" w:sz="4" w:color="B9C2CC"/>
+              <w:insideV w:val="single" w:sz="4" w:color="B9C2CC"/>
+            </w:tcBorders>
+            <w:tcMar>
+              <w:top w:w="90" w:type="dxa"/>
+              <w:bottom w:w="90" w:type="dxa"/>
+              <w:start w:w="110" w:type="dxa"/>
+              <w:end w:w="110" w:type="dxa"/>
+            </w:tcMar>
+          </w:tcPr>
+          <w:p>
+            <w:pPr>
+              <w:spacing w:before="0" w:after="0" w:line="252" w:lineRule="auto"/>
+              <w:jc w:val="left"/>
+            </w:pPr>
+            <w:r>
+              <w:rPr>
+                <w:rFonts w:ascii="Arial" w:hAnsi="Arial"/>
+                <w:b/>
+                <w:color w:val="181B1F"/>
+                <w:sz w:val="16"/>
+              </w:rPr>
+              <w:t>MRR</w:t>
+            </w:r>
+          </w:p>
+        </w:tc>
+        <w:tc>
+          <w:tcPr>
+            <w:tcW w:type="dxa" w:w="1284"/>
+            <w:vAlign w:val="center"/>
+            <w:shd w:fill="E8EEF5"/>
+            <w:tcBorders>
+              <w:top w:val="single" w:sz="4" w:color="B9C2CC"/>
+              <w:left w:val="single" w:sz="4" w:color="B9C2CC"/>
+              <w:bottom w:val="single" w:sz="4" w:color="B9C2CC"/>
+              <w:right w:val="single" w:sz="4" w:color="B9C2CC"/>
+              <w:insideH w:val="single" w:sz="4" w:color="B9C2CC"/>
+              <w:insideV w:val="single" w:sz="4" w:color="B9C2CC"/>
+            </w:tcBorders>
+            <w:tcMar>
+              <w:top w:w="90" w:type="dxa"/>
+              <w:bottom w:w="90" w:type="dxa"/>
+              <w:start w:w="110" w:type="dxa"/>
+              <w:end w:w="110" w:type="dxa"/>
+            </w:tcMar>
+          </w:tcPr>
+          <w:p>
+            <w:pPr>
+              <w:spacing w:before="0" w:after="0" w:line="252" w:lineRule="auto"/>
+              <w:jc w:val="center"/>
+            </w:pPr>
+            <w:r>
+              <w:rPr>
+                <w:rFonts w:ascii="Arial" w:hAnsi="Arial"/>
+                <w:b/>
+                <w:color w:val="181B1F"/>
+                <w:sz w:val="16"/>
+              </w:rPr>
+              <w:t>Recall@1</w:t>
+            </w:r>
+          </w:p>
+        </w:tc>
+        <w:tc>
+          <w:tcPr>
+            <w:tcW w:type="dxa" w:w="1445"/>
+            <w:vAlign w:val="center"/>
+            <w:shd w:fill="E8EEF5"/>
+            <w:tcBorders>
+              <w:top w:val="single" w:sz="4" w:color="B9C2CC"/>
+              <w:left w:val="single" w:sz="4" w:color="B9C2CC"/>
+              <w:bottom w:val="single" w:sz="4" w:color="B9C2CC"/>
+              <w:right w:val="single" w:sz="4" w:color="B9C2CC"/>
+              <w:insideH w:val="single" w:sz="4" w:color="B9C2CC"/>
+              <w:insideV w:val="single" w:sz="4" w:color="B9C2CC"/>
+            </w:tcBorders>
+            <w:tcMar>
+              <w:top w:w="90" w:type="dxa"/>
+              <w:bottom w:w="90" w:type="dxa"/>
+              <w:start w:w="110" w:type="dxa"/>
+              <w:end w:w="110" w:type="dxa"/>
+            </w:tcMar>
+          </w:tcPr>
+          <w:p>
+            <w:pPr>
+              <w:spacing w:before="0" w:after="0" w:line="252" w:lineRule="auto"/>
+              <w:jc w:val="center"/>
+            </w:pPr>
+            <w:r>
+              <w:rPr>
+                <w:rFonts w:ascii="Arial" w:hAnsi="Arial"/>
+                <w:b/>
+                <w:color w:val="181B1F"/>
+                <w:sz w:val="16"/>
+              </w:rPr>
+              <w:t>Recall@10</w:t>
+            </w:r>
+          </w:p>
+        </w:tc>
+        <w:tc>
+          <w:tcPr>
+            <w:tcW w:type="dxa" w:w="2890"/>
+            <w:vAlign w:val="center"/>
+            <w:shd w:fill="E8EEF5"/>
+            <w:tcBorders>
+              <w:top w:val="single" w:sz="4" w:color="B9C2CC"/>
+              <w:left w:val="single" w:sz="4" w:color="B9C2CC"/>
+              <w:bottom w:val="single" w:sz="4" w:color="B9C2CC"/>
+              <w:right w:val="single" w:sz="4" w:color="B9C2CC"/>
+              <w:insideH w:val="single" w:sz="4" w:color="B9C2CC"/>
+              <w:insideV w:val="single" w:sz="4" w:color="B9C2CC"/>
+            </w:tcBorders>
+            <w:tcMar>
+              <w:top w:w="90" w:type="dxa"/>
+              <w:bottom w:w="90" w:type="dxa"/>
+              <w:start w:w="110" w:type="dxa"/>
+              <w:end w:w="110" w:type="dxa"/>
+            </w:tcMar>
+          </w:tcPr>
+          <w:p>
+            <w:pPr>
+              <w:spacing w:before="0" w:after="0" w:line="252" w:lineRule="auto"/>
+              <w:jc w:val="center"/>
+            </w:pPr>
+            <w:r>
+              <w:rPr>
+                <w:rFonts w:ascii="Arial" w:hAnsi="Arial"/>
+                <w:b/>
+                <w:color w:val="181B1F"/>
+                <w:sz w:val="16"/>
+              </w:rPr>
+              <w:t>False-novelty rate</w:t>
+            </w:r>
+          </w:p>
+        </w:tc>
+      </w:tr>
+      <w:tr>
+        <w:trPr>
+          <w:trHeight w:hRule="atLeast"/>
+        </w:trPr>
+        <w:tc>
+          <w:tcPr>
+            <w:tcW w:type="dxa" w:w="2247"/>
+            <w:vAlign w:val="center"/>
+            <w:tcBorders>
+              <w:top w:val="single" w:sz="4" w:color="B9C2CC"/>
+              <w:left w:val="single" w:sz="4" w:color="B9C2CC"/>
+              <w:bottom w:val="single" w:sz="4" w:color="B9C2CC"/>
+              <w:right w:val="single" w:sz="4" w:color="B9C2CC"/>
+              <w:insideH w:val="single" w:sz="4" w:color="B9C2CC"/>
+              <w:insideV w:val="single" w:sz="4" w:color="B9C2CC"/>
+            </w:tcBorders>
+            <w:tcMar>
+              <w:top w:w="90" w:type="dxa"/>
+              <w:bottom w:w="90" w:type="dxa"/>
+              <w:start w:w="110" w:type="dxa"/>
+              <w:end w:w="110" w:type="dxa"/>
+            </w:tcMar>
+          </w:tcPr>
+          <w:p>
+            <w:pPr>
+              <w:spacing w:before="0" w:after="0" w:line="252" w:lineRule="auto"/>
+              <w:jc w:val="left"/>
+            </w:pPr>
+            <w:r>
+              <w:rPr>
+                <w:rFonts w:ascii="Arial" w:hAnsi="Arial"/>
+                <w:b w:val="0"/>
+                <w:color w:val="181B1F"/>
+                <w:sz w:val="16"/>
+              </w:rPr>
+              <w:t>Frequency</w:t>
+            </w:r>
+          </w:p>
+        </w:tc>
+        <w:tc>
+          <w:tcPr>
+            <w:tcW w:type="dxa" w:w="963"/>
+            <w:vAlign w:val="center"/>
+            <w:tcBorders>
+              <w:top w:val="single" w:sz="4" w:color="B9C2CC"/>
+              <w:left w:val="single" w:sz="4" w:color="B9C2CC"/>
+              <w:bottom w:val="single" w:sz="4" w:color="B9C2CC"/>
+              <w:right w:val="single" w:sz="4" w:color="B9C2CC"/>
+              <w:insideH w:val="single" w:sz="4" w:color="B9C2CC"/>
+              <w:insideV w:val="single" w:sz="4" w:color="B9C2CC"/>
+            </w:tcBorders>
+            <w:tcMar>
+              <w:top w:w="90" w:type="dxa"/>
+              <w:bottom w:w="90" w:type="dxa"/>
+              <w:start w:w="110" w:type="dxa"/>
+              <w:end w:w="110" w:type="dxa"/>
+            </w:tcMar>
+          </w:tcPr>
+          <w:p>
+            <w:pPr>
+              <w:spacing w:before="0" w:after="0" w:line="252" w:lineRule="auto"/>
+              <w:jc w:val="left"/>
+            </w:pPr>
+            <w:r>
+              <w:rPr>
+                <w:rFonts w:ascii="Arial" w:hAnsi="Arial"/>
+                <w:b w:val="0"/>
+                <w:color w:val="181B1F"/>
+                <w:sz w:val="16"/>
+              </w:rPr>
+              <w:t>1</w:t>
+            </w:r>
+          </w:p>
+        </w:tc>
+        <w:tc>
+          <w:tcPr>
+            <w:tcW w:type="dxa" w:w="963"/>
+            <w:vAlign w:val="center"/>
+            <w:tcBorders>
+              <w:top w:val="single" w:sz="4" w:color="B9C2CC"/>
+              <w:left w:val="single" w:sz="4" w:color="B9C2CC"/>
+              <w:bottom w:val="single" w:sz="4" w:color="B9C2CC"/>
+              <w:right w:val="single" w:sz="4" w:color="B9C2CC"/>
+              <w:insideH w:val="single" w:sz="4" w:color="B9C2CC"/>
+              <w:insideV w:val="single" w:sz="4" w:color="B9C2CC"/>
+            </w:tcBorders>
+            <w:tcMar>
+              <w:top w:w="90" w:type="dxa"/>
+              <w:bottom w:w="90" w:type="dxa"/>
+              <w:start w:w="110" w:type="dxa"/>
+              <w:end w:w="110" w:type="dxa"/>
+            </w:tcMar>
+          </w:tcPr>
+          <w:p>
+            <w:pPr>
+              <w:spacing w:before="0" w:after="0" w:line="252" w:lineRule="auto"/>
+              <w:jc w:val="left"/>
+            </w:pPr>
+            <w:r>
+              <w:rPr>
+                <w:rFonts w:ascii="Arial" w:hAnsi="Arial"/>
+                <w:b w:val="0"/>
+                <w:color w:val="181B1F"/>
+                <w:sz w:val="16"/>
+              </w:rPr>
+              <w:t>0.333</w:t>
+            </w:r>
+          </w:p>
+        </w:tc>
+        <w:tc>
+          <w:tcPr>
+            <w:tcW w:type="dxa" w:w="1284"/>
+            <w:vAlign w:val="center"/>
+            <w:tcBorders>
+              <w:top w:val="single" w:sz="4" w:color="B9C2CC"/>
+              <w:left w:val="single" w:sz="4" w:color="B9C2CC"/>
+              <w:bottom w:val="single" w:sz="4" w:color="B9C2CC"/>
+              <w:right w:val="single" w:sz="4" w:color="B9C2CC"/>
+              <w:insideH w:val="single" w:sz="4" w:color="B9C2CC"/>
+              <w:insideV w:val="single" w:sz="4" w:color="B9C2CC"/>
+            </w:tcBorders>
+            <w:tcMar>
+              <w:top w:w="90" w:type="dxa"/>
+              <w:bottom w:w="90" w:type="dxa"/>
+              <w:start w:w="110" w:type="dxa"/>
+              <w:end w:w="110" w:type="dxa"/>
+            </w:tcMar>
+          </w:tcPr>
+          <w:p>
+            <w:pPr>
+              <w:spacing w:before="0" w:after="0" w:line="252" w:lineRule="auto"/>
+              <w:jc w:val="center"/>
+            </w:pPr>
+            <w:r>
+              <w:rPr>
+                <w:rFonts w:ascii="Arial" w:hAnsi="Arial"/>
+                <w:b w:val="0"/>
+                <w:color w:val="181B1F"/>
+                <w:sz w:val="16"/>
+              </w:rPr>
+              <w:t>0.000</w:t>
+            </w:r>
+          </w:p>
+        </w:tc>
+        <w:tc>
+          <w:tcPr>
+            <w:tcW w:type="dxa" w:w="1445"/>
+            <w:vAlign w:val="center"/>
+            <w:tcBorders>
+              <w:top w:val="single" w:sz="4" w:color="B9C2CC"/>
+              <w:left w:val="single" w:sz="4" w:color="B9C2CC"/>
+              <w:bottom w:val="single" w:sz="4" w:color="B9C2CC"/>
+              <w:right w:val="single" w:sz="4" w:color="B9C2CC"/>
+              <w:insideH w:val="single" w:sz="4" w:color="B9C2CC"/>
+              <w:insideV w:val="single" w:sz="4" w:color="B9C2CC"/>
+            </w:tcBorders>
+            <w:tcMar>
+              <w:top w:w="90" w:type="dxa"/>
+              <w:bottom w:w="90" w:type="dxa"/>
+              <w:start w:w="110" w:type="dxa"/>
+              <w:end w:w="110" w:type="dxa"/>
+            </w:tcMar>
+          </w:tcPr>
+          <w:p>
+            <w:pPr>
+              <w:spacing w:before="0" w:after="0" w:line="252" w:lineRule="auto"/>
+              <w:jc w:val="center"/>
+            </w:pPr>
+            <w:r>
+              <w:rPr>
+                <w:rFonts w:ascii="Arial" w:hAnsi="Arial"/>
+                <w:b w:val="0"/>
+                <w:color w:val="181B1F"/>
+                <w:sz w:val="16"/>
+              </w:rPr>
+              <w:t>1.000</w:t>
+            </w:r>
+          </w:p>
+        </w:tc>
+        <w:tc>
+          <w:tcPr>
+            <w:tcW w:type="dxa" w:w="2890"/>
+            <w:vAlign w:val="center"/>
+            <w:tcBorders>
+              <w:top w:val="single" w:sz="4" w:color="B9C2CC"/>
+              <w:left w:val="single" w:sz="4" w:color="B9C2CC"/>
+              <w:bottom w:val="single" w:sz="4" w:color="B9C2CC"/>
+              <w:right w:val="single" w:sz="4" w:color="B9C2CC"/>
+              <w:insideH w:val="single" w:sz="4" w:color="B9C2CC"/>
+              <w:insideV w:val="single" w:sz="4" w:color="B9C2CC"/>
+            </w:tcBorders>
+            <w:tcMar>
+              <w:top w:w="90" w:type="dxa"/>
+              <w:bottom w:w="90" w:type="dxa"/>
+              <w:start w:w="110" w:type="dxa"/>
+              <w:end w:w="110" w:type="dxa"/>
+            </w:tcMar>
+          </w:tcPr>
+          <w:p>
+            <w:pPr>
+              <w:spacing w:before="0" w:after="0" w:line="252" w:lineRule="auto"/>
+              <w:jc w:val="center"/>
+            </w:pPr>
+            <w:r>
+              <w:rPr>
+                <w:rFonts w:ascii="Arial" w:hAnsi="Arial"/>
+                <w:b w:val="0"/>
+                <w:color w:val="181B1F"/>
+                <w:sz w:val="16"/>
+              </w:rPr>
+              <w:t>0.000</w:t>
+            </w:r>
+          </w:p>
+        </w:tc>
+      </w:tr>
+      <w:tr>
+        <w:trPr>
+          <w:trHeight w:hRule="atLeast"/>
+        </w:trPr>
+        <w:tc>
+          <w:tcPr>
+            <w:tcW w:type="dxa" w:w="2247"/>
+            <w:vAlign w:val="center"/>
+            <w:tcBorders>
+              <w:top w:val="single" w:sz="4" w:color="B9C2CC"/>
+              <w:left w:val="single" w:sz="4" w:color="B9C2CC"/>
+              <w:bottom w:val="single" w:sz="4" w:color="B9C2CC"/>
+              <w:right w:val="single" w:sz="4" w:color="B9C2CC"/>
+              <w:insideH w:val="single" w:sz="4" w:color="B9C2CC"/>
+              <w:insideV w:val="single" w:sz="4" w:color="B9C2CC"/>
+            </w:tcBorders>
+            <w:tcMar>
+              <w:top w:w="90" w:type="dxa"/>
+              <w:bottom w:w="90" w:type="dxa"/>
+              <w:start w:w="110" w:type="dxa"/>
+              <w:end w:w="110" w:type="dxa"/>
+            </w:tcMar>
+          </w:tcPr>
+          <w:p>
+            <w:pPr>
+              <w:spacing w:before="0" w:after="0" w:line="252" w:lineRule="auto"/>
+              <w:jc w:val="left"/>
+            </w:pPr>
+            <w:r>
+              <w:rPr>
+                <w:rFonts w:ascii="Arial" w:hAnsi="Arial"/>
+                <w:b w:val="0"/>
+                <w:color w:val="181B1F"/>
+                <w:sz w:val="16"/>
+              </w:rPr>
+              <w:t>TF–IDF</w:t>
+            </w:r>
+          </w:p>
+        </w:tc>
+        <w:tc>
+          <w:tcPr>
+            <w:tcW w:type="dxa" w:w="963"/>
+            <w:vAlign w:val="center"/>
+            <w:tcBorders>
+              <w:top w:val="single" w:sz="4" w:color="B9C2CC"/>
+              <w:left w:val="single" w:sz="4" w:color="B9C2CC"/>
+              <w:bottom w:val="single" w:sz="4" w:color="B9C2CC"/>
+              <w:right w:val="single" w:sz="4" w:color="B9C2CC"/>
+              <w:insideH w:val="single" w:sz="4" w:color="B9C2CC"/>
+              <w:insideV w:val="single" w:sz="4" w:color="B9C2CC"/>
+            </w:tcBorders>
+            <w:tcMar>
+              <w:top w:w="90" w:type="dxa"/>
+              <w:bottom w:w="90" w:type="dxa"/>
+              <w:start w:w="110" w:type="dxa"/>
+              <w:end w:w="110" w:type="dxa"/>
+            </w:tcMar>
+          </w:tcPr>
+          <w:p>
+            <w:pPr>
+              <w:spacing w:before="0" w:after="0" w:line="252" w:lineRule="auto"/>
+              <w:jc w:val="left"/>
+            </w:pPr>
+            <w:r>
+              <w:rPr>
+                <w:rFonts w:ascii="Arial" w:hAnsi="Arial"/>
+                <w:b w:val="0"/>
+                <w:color w:val="181B1F"/>
+                <w:sz w:val="16"/>
+              </w:rPr>
+              <w:t>1</w:t>
+            </w:r>
+          </w:p>
+        </w:tc>
+        <w:tc>
+          <w:tcPr>
+            <w:tcW w:type="dxa" w:w="963"/>
+            <w:vAlign w:val="center"/>
+            <w:tcBorders>
+              <w:top w:val="single" w:sz="4" w:color="B9C2CC"/>
+              <w:left w:val="single" w:sz="4" w:color="B9C2CC"/>
+              <w:bottom w:val="single" w:sz="4" w:color="B9C2CC"/>
+              <w:right w:val="single" w:sz="4" w:color="B9C2CC"/>
+              <w:insideH w:val="single" w:sz="4" w:color="B9C2CC"/>
+              <w:insideV w:val="single" w:sz="4" w:color="B9C2CC"/>
+            </w:tcBorders>
+            <w:tcMar>
+              <w:top w:w="90" w:type="dxa"/>
+              <w:bottom w:w="90" w:type="dxa"/>
+              <w:start w:w="110" w:type="dxa"/>
+              <w:end w:w="110" w:type="dxa"/>
+            </w:tcMar>
+          </w:tcPr>
+          <w:p>
+            <w:pPr>
+              <w:spacing w:before="0" w:after="0" w:line="252" w:lineRule="auto"/>
+              <w:jc w:val="left"/>
+            </w:pPr>
+            <w:r>
+              <w:rPr>
+                <w:rFonts w:ascii="Arial" w:hAnsi="Arial"/>
+                <w:b w:val="0"/>
+                <w:color w:val="181B1F"/>
+                <w:sz w:val="16"/>
+              </w:rPr>
+              <w:t>0.500</w:t>
+            </w:r>
+          </w:p>
+        </w:tc>
+        <w:tc>
+          <w:tcPr>
+            <w:tcW w:type="dxa" w:w="1284"/>
+            <w:vAlign w:val="center"/>
+            <w:tcBorders>
+              <w:top w:val="single" w:sz="4" w:color="B9C2CC"/>
+              <w:left w:val="single" w:sz="4" w:color="B9C2CC"/>
+              <w:bottom w:val="single" w:sz="4" w:color="B9C2CC"/>
+              <w:right w:val="single" w:sz="4" w:color="B9C2CC"/>
+              <w:insideH w:val="single" w:sz="4" w:color="B9C2CC"/>
+              <w:insideV w:val="single" w:sz="4" w:color="B9C2CC"/>
+            </w:tcBorders>
+            <w:tcMar>
+              <w:top w:w="90" w:type="dxa"/>
+              <w:bottom w:w="90" w:type="dxa"/>
+              <w:start w:w="110" w:type="dxa"/>
+              <w:end w:w="110" w:type="dxa"/>
+            </w:tcMar>
+          </w:tcPr>
+          <w:p>
+            <w:pPr>
+              <w:spacing w:before="0" w:after="0" w:line="252" w:lineRule="auto"/>
+              <w:jc w:val="center"/>
+            </w:pPr>
+            <w:r>
+              <w:rPr>
+                <w:rFonts w:ascii="Arial" w:hAnsi="Arial"/>
+                <w:b w:val="0"/>
+                <w:color w:val="181B1F"/>
+                <w:sz w:val="16"/>
+              </w:rPr>
+              <w:t>0.000</w:t>
+            </w:r>
+          </w:p>
+        </w:tc>
+        <w:tc>
+          <w:tcPr>
+            <w:tcW w:type="dxa" w:w="1445"/>
+            <w:vAlign w:val="center"/>
+            <w:tcBorders>
+              <w:top w:val="single" w:sz="4" w:color="B9C2CC"/>
+              <w:left w:val="single" w:sz="4" w:color="B9C2CC"/>
+              <w:bottom w:val="single" w:sz="4" w:color="B9C2CC"/>
+              <w:right w:val="single" w:sz="4" w:color="B9C2CC"/>
+              <w:insideH w:val="single" w:sz="4" w:color="B9C2CC"/>
+              <w:insideV w:val="single" w:sz="4" w:color="B9C2CC"/>
+            </w:tcBorders>
+            <w:tcMar>
+              <w:top w:w="90" w:type="dxa"/>
+              <w:bottom w:w="90" w:type="dxa"/>
+              <w:start w:w="110" w:type="dxa"/>
+              <w:end w:w="110" w:type="dxa"/>
+            </w:tcMar>
+          </w:tcPr>
+          <w:p>
+            <w:pPr>
+              <w:spacing w:before="0" w:after="0" w:line="252" w:lineRule="auto"/>
+              <w:jc w:val="center"/>
+            </w:pPr>
+            <w:r>
+              <w:rPr>
+                <w:rFonts w:ascii="Arial" w:hAnsi="Arial"/>
+                <w:b w:val="0"/>
+                <w:color w:val="181B1F"/>
+                <w:sz w:val="16"/>
+              </w:rPr>
+              <w:t>1.000</w:t>
+            </w:r>
+          </w:p>
+        </w:tc>
+        <w:tc>
+          <w:tcPr>
+            <w:tcW w:type="dxa" w:w="2890"/>
+            <w:vAlign w:val="center"/>
+            <w:tcBorders>
+              <w:top w:val="single" w:sz="4" w:color="B9C2CC"/>
+              <w:left w:val="single" w:sz="4" w:color="B9C2CC"/>
+              <w:bottom w:val="single" w:sz="4" w:color="B9C2CC"/>
+              <w:right w:val="single" w:sz="4" w:color="B9C2CC"/>
+              <w:insideH w:val="single" w:sz="4" w:color="B9C2CC"/>
+              <w:insideV w:val="single" w:sz="4" w:color="B9C2CC"/>
+            </w:tcBorders>
+            <w:tcMar>
+              <w:top w:w="90" w:type="dxa"/>
+              <w:bottom w:w="90" w:type="dxa"/>
+              <w:start w:w="110" w:type="dxa"/>
+              <w:end w:w="110" w:type="dxa"/>
+            </w:tcMar>
+          </w:tcPr>
+          <w:p>
+            <w:pPr>
+              <w:spacing w:before="0" w:after="0" w:line="252" w:lineRule="auto"/>
+              <w:jc w:val="center"/>
+            </w:pPr>
+            <w:r>
+              <w:rPr>
+                <w:rFonts w:ascii="Arial" w:hAnsi="Arial"/>
+                <w:b w:val="0"/>
+                <w:color w:val="181B1F"/>
+                <w:sz w:val="16"/>
+              </w:rPr>
+              <w:t>0.000</w:t>
+            </w:r>
+          </w:p>
+        </w:tc>
+      </w:tr>
+      <w:tr>
+        <w:trPr>
+          <w:trHeight w:hRule="atLeast"/>
+        </w:trPr>
+        <w:tc>
+          <w:tcPr>
+            <w:tcW w:type="dxa" w:w="2247"/>
+            <w:vAlign w:val="center"/>
+            <w:tcBorders>
+              <w:top w:val="single" w:sz="4" w:color="B9C2CC"/>
+              <w:left w:val="single" w:sz="4" w:color="B9C2CC"/>
+              <w:bottom w:val="single" w:sz="4" w:color="B9C2CC"/>
+              <w:right w:val="single" w:sz="4" w:color="B9C2CC"/>
+              <w:insideH w:val="single" w:sz="4" w:color="B9C2CC"/>
+              <w:insideV w:val="single" w:sz="4" w:color="B9C2CC"/>
+            </w:tcBorders>
+            <w:tcMar>
+              <w:top w:w="90" w:type="dxa"/>
+              <w:bottom w:w="90" w:type="dxa"/>
+              <w:start w:w="110" w:type="dxa"/>
+              <w:end w:w="110" w:type="dxa"/>
+            </w:tcMar>
+          </w:tcPr>
+          <w:p>
+            <w:pPr>
+              <w:spacing w:before="0" w:after="0" w:line="252" w:lineRule="auto"/>
+              <w:jc w:val="left"/>
+            </w:pPr>
+            <w:r>
+              <w:rPr>
+                <w:rFonts w:ascii="Arial" w:hAnsi="Arial"/>
+                <w:b w:val="0"/>
+                <w:color w:val="181B1F"/>
+                <w:sz w:val="16"/>
+              </w:rPr>
+              <w:t>A–B/B–C bridge</w:t>
+            </w:r>
+          </w:p>
+        </w:tc>
+        <w:tc>
+          <w:tcPr>
+            <w:tcW w:type="dxa" w:w="963"/>
+            <w:vAlign w:val="center"/>
+            <w:tcBorders>
+              <w:top w:val="single" w:sz="4" w:color="B9C2CC"/>
+              <w:left w:val="single" w:sz="4" w:color="B9C2CC"/>
+              <w:bottom w:val="single" w:sz="4" w:color="B9C2CC"/>
+              <w:right w:val="single" w:sz="4" w:color="B9C2CC"/>
+              <w:insideH w:val="single" w:sz="4" w:color="B9C2CC"/>
+              <w:insideV w:val="single" w:sz="4" w:color="B9C2CC"/>
+            </w:tcBorders>
+            <w:tcMar>
+              <w:top w:w="90" w:type="dxa"/>
+              <w:bottom w:w="90" w:type="dxa"/>
+              <w:start w:w="110" w:type="dxa"/>
+              <w:end w:w="110" w:type="dxa"/>
+            </w:tcMar>
+          </w:tcPr>
+          <w:p>
+            <w:pPr>
+              <w:spacing w:before="0" w:after="0" w:line="252" w:lineRule="auto"/>
+              <w:jc w:val="left"/>
+            </w:pPr>
+            <w:r>
+              <w:rPr>
+                <w:rFonts w:ascii="Arial" w:hAnsi="Arial"/>
+                <w:b w:val="0"/>
+                <w:color w:val="181B1F"/>
+                <w:sz w:val="16"/>
+              </w:rPr>
+              <w:t>1</w:t>
+            </w:r>
+          </w:p>
+        </w:tc>
+        <w:tc>
+          <w:tcPr>
+            <w:tcW w:type="dxa" w:w="963"/>
+            <w:vAlign w:val="center"/>
+            <w:tcBorders>
+              <w:top w:val="single" w:sz="4" w:color="B9C2CC"/>
+              <w:left w:val="single" w:sz="4" w:color="B9C2CC"/>
+              <w:bottom w:val="single" w:sz="4" w:color="B9C2CC"/>
+              <w:right w:val="single" w:sz="4" w:color="B9C2CC"/>
+              <w:insideH w:val="single" w:sz="4" w:color="B9C2CC"/>
+              <w:insideV w:val="single" w:sz="4" w:color="B9C2CC"/>
+            </w:tcBorders>
+            <w:tcMar>
+              <w:top w:w="90" w:type="dxa"/>
+              <w:bottom w:w="90" w:type="dxa"/>
+              <w:start w:w="110" w:type="dxa"/>
+              <w:end w:w="110" w:type="dxa"/>
+            </w:tcMar>
+          </w:tcPr>
+          <w:p>
+            <w:pPr>
+              <w:spacing w:before="0" w:after="0" w:line="252" w:lineRule="auto"/>
+              <w:jc w:val="left"/>
+            </w:pPr>
+            <w:r>
+              <w:rPr>
+                <w:rFonts w:ascii="Arial" w:hAnsi="Arial"/>
+                <w:b w:val="0"/>
+                <w:color w:val="181B1F"/>
+                <w:sz w:val="16"/>
+              </w:rPr>
+              <w:t>1.000</w:t>
+            </w:r>
+          </w:p>
+        </w:tc>
+        <w:tc>
+          <w:tcPr>
+            <w:tcW w:type="dxa" w:w="1284"/>
+            <w:vAlign w:val="center"/>
+            <w:tcBorders>
+              <w:top w:val="single" w:sz="4" w:color="B9C2CC"/>
+              <w:left w:val="single" w:sz="4" w:color="B9C2CC"/>
+              <w:bottom w:val="single" w:sz="4" w:color="B9C2CC"/>
+              <w:right w:val="single" w:sz="4" w:color="B9C2CC"/>
+              <w:insideH w:val="single" w:sz="4" w:color="B9C2CC"/>
+              <w:insideV w:val="single" w:sz="4" w:color="B9C2CC"/>
+            </w:tcBorders>
+            <w:tcMar>
+              <w:top w:w="90" w:type="dxa"/>
+              <w:bottom w:w="90" w:type="dxa"/>
+              <w:start w:w="110" w:type="dxa"/>
+              <w:end w:w="110" w:type="dxa"/>
+            </w:tcMar>
+          </w:tcPr>
+          <w:p>
+            <w:pPr>
+              <w:spacing w:before="0" w:after="0" w:line="252" w:lineRule="auto"/>
+              <w:jc w:val="center"/>
+            </w:pPr>
+            <w:r>
+              <w:rPr>
+                <w:rFonts w:ascii="Arial" w:hAnsi="Arial"/>
+                <w:b w:val="0"/>
+                <w:color w:val="181B1F"/>
+                <w:sz w:val="16"/>
+              </w:rPr>
+              <w:t>1.000</w:t>
+            </w:r>
+          </w:p>
+        </w:tc>
+        <w:tc>
+          <w:tcPr>
+            <w:tcW w:type="dxa" w:w="1445"/>
+            <w:vAlign w:val="center"/>
+            <w:tcBorders>
+              <w:top w:val="single" w:sz="4" w:color="B9C2CC"/>
+              <w:left w:val="single" w:sz="4" w:color="B9C2CC"/>
+              <w:bottom w:val="single" w:sz="4" w:color="B9C2CC"/>
+              <w:right w:val="single" w:sz="4" w:color="B9C2CC"/>
+              <w:insideH w:val="single" w:sz="4" w:color="B9C2CC"/>
+              <w:insideV w:val="single" w:sz="4" w:color="B9C2CC"/>
+            </w:tcBorders>
+            <w:tcMar>
+              <w:top w:w="90" w:type="dxa"/>
+              <w:bottom w:w="90" w:type="dxa"/>
+              <w:start w:w="110" w:type="dxa"/>
+              <w:end w:w="110" w:type="dxa"/>
+            </w:tcMar>
+          </w:tcPr>
+          <w:p>
+            <w:pPr>
+              <w:spacing w:before="0" w:after="0" w:line="252" w:lineRule="auto"/>
+              <w:jc w:val="center"/>
+            </w:pPr>
+            <w:r>
+              <w:rPr>
+                <w:rFonts w:ascii="Arial" w:hAnsi="Arial"/>
+                <w:b w:val="0"/>
+                <w:color w:val="181B1F"/>
+                <w:sz w:val="16"/>
+              </w:rPr>
+              <w:t>1.000</w:t>
+            </w:r>
+          </w:p>
+        </w:tc>
+        <w:tc>
+          <w:tcPr>
+            <w:tcW w:type="dxa" w:w="2890"/>
+            <w:vAlign w:val="center"/>
+            <w:tcBorders>
+              <w:top w:val="single" w:sz="4" w:color="B9C2CC"/>
+              <w:left w:val="single" w:sz="4" w:color="B9C2CC"/>
+              <w:bottom w:val="single" w:sz="4" w:color="B9C2CC"/>
+              <w:right w:val="single" w:sz="4" w:color="B9C2CC"/>
+              <w:insideH w:val="single" w:sz="4" w:color="B9C2CC"/>
+              <w:insideV w:val="single" w:sz="4" w:color="B9C2CC"/>
+            </w:tcBorders>
+            <w:tcMar>
+              <w:top w:w="90" w:type="dxa"/>
+              <w:bottom w:w="90" w:type="dxa"/>
+              <w:start w:w="110" w:type="dxa"/>
+              <w:end w:w="110" w:type="dxa"/>
+            </w:tcMar>
+          </w:tcPr>
+          <w:p>
+            <w:pPr>
+              <w:spacing w:before="0" w:after="0" w:line="252" w:lineRule="auto"/>
+              <w:jc w:val="center"/>
+            </w:pPr>
+            <w:r>
+              <w:rPr>
+                <w:rFonts w:ascii="Arial" w:hAnsi="Arial"/>
+                <w:b w:val="0"/>
+                <w:color w:val="181B1F"/>
+                <w:sz w:val="16"/>
+              </w:rPr>
+              <w:t>0.000</w:t>
+            </w:r>
+          </w:p>
+        </w:tc>
+      </w:tr>
+      <w:tr>
+        <w:trPr>
+          <w:trHeight w:hRule="atLeast"/>
+        </w:trPr>
+        <w:tc>
+          <w:tcPr>
+            <w:tcW w:type="dxa" w:w="2247"/>
+            <w:vAlign w:val="center"/>
+            <w:tcBorders>
+              <w:top w:val="single" w:sz="4" w:color="B9C2CC"/>
+              <w:left w:val="single" w:sz="4" w:color="B9C2CC"/>
+              <w:bottom w:val="single" w:sz="4" w:color="B9C2CC"/>
+              <w:right w:val="single" w:sz="4" w:color="B9C2CC"/>
+              <w:insideH w:val="single" w:sz="4" w:color="B9C2CC"/>
+              <w:insideV w:val="single" w:sz="4" w:color="B9C2CC"/>
+            </w:tcBorders>
+            <w:tcMar>
+              <w:top w:w="90" w:type="dxa"/>
+              <w:bottom w:w="90" w:type="dxa"/>
+              <w:start w:w="110" w:type="dxa"/>
+              <w:end w:w="110" w:type="dxa"/>
+            </w:tcMar>
+          </w:tcPr>
+          <w:p>
+            <w:pPr>
+              <w:spacing w:before="0" w:after="0" w:line="252" w:lineRule="auto"/>
+              <w:jc w:val="left"/>
+            </w:pPr>
+            <w:r>
+              <w:rPr>
+                <w:rFonts w:ascii="Arial" w:hAnsi="Arial"/>
+                <w:b w:val="0"/>
+                <w:color w:val="181B1F"/>
+                <w:sz w:val="16"/>
+              </w:rPr>
+              <w:t>Evidence-aware</w:t>
+            </w:r>
+          </w:p>
+        </w:tc>
+        <w:tc>
+          <w:tcPr>
+            <w:tcW w:type="dxa" w:w="963"/>
+            <w:vAlign w:val="center"/>
+            <w:tcBorders>
+              <w:top w:val="single" w:sz="4" w:color="B9C2CC"/>
+              <w:left w:val="single" w:sz="4" w:color="B9C2CC"/>
+              <w:bottom w:val="single" w:sz="4" w:color="B9C2CC"/>
+              <w:right w:val="single" w:sz="4" w:color="B9C2CC"/>
+              <w:insideH w:val="single" w:sz="4" w:color="B9C2CC"/>
+              <w:insideV w:val="single" w:sz="4" w:color="B9C2CC"/>
+            </w:tcBorders>
+            <w:tcMar>
+              <w:top w:w="90" w:type="dxa"/>
+              <w:bottom w:w="90" w:type="dxa"/>
+              <w:start w:w="110" w:type="dxa"/>
+              <w:end w:w="110" w:type="dxa"/>
+            </w:tcMar>
+          </w:tcPr>
+          <w:p>
+            <w:pPr>
+              <w:spacing w:before="0" w:after="0" w:line="252" w:lineRule="auto"/>
+              <w:jc w:val="left"/>
+            </w:pPr>
+            <w:r>
+              <w:rPr>
+                <w:rFonts w:ascii="Arial" w:hAnsi="Arial"/>
+                <w:b w:val="0"/>
+                <w:color w:val="181B1F"/>
+                <w:sz w:val="16"/>
+              </w:rPr>
+              <w:t>1</w:t>
+            </w:r>
+          </w:p>
+        </w:tc>
+        <w:tc>
+          <w:tcPr>
+            <w:tcW w:type="dxa" w:w="963"/>
+            <w:vAlign w:val="center"/>
+            <w:tcBorders>
+              <w:top w:val="single" w:sz="4" w:color="B9C2CC"/>
+              <w:left w:val="single" w:sz="4" w:color="B9C2CC"/>
+              <w:bottom w:val="single" w:sz="4" w:color="B9C2CC"/>
+              <w:right w:val="single" w:sz="4" w:color="B9C2CC"/>
+              <w:insideH w:val="single" w:sz="4" w:color="B9C2CC"/>
+              <w:insideV w:val="single" w:sz="4" w:color="B9C2CC"/>
+            </w:tcBorders>
+            <w:tcMar>
+              <w:top w:w="90" w:type="dxa"/>
+              <w:bottom w:w="90" w:type="dxa"/>
+              <w:start w:w="110" w:type="dxa"/>
+              <w:end w:w="110" w:type="dxa"/>
+            </w:tcMar>
+          </w:tcPr>
+          <w:p>
+            <w:pPr>
+              <w:spacing w:before="0" w:after="0" w:line="252" w:lineRule="auto"/>
+              <w:jc w:val="left"/>
+            </w:pPr>
+            <w:r>
+              <w:rPr>
+                <w:rFonts w:ascii="Arial" w:hAnsi="Arial"/>
+                <w:b w:val="0"/>
+                <w:color w:val="181B1F"/>
+                <w:sz w:val="16"/>
+              </w:rPr>
+              <w:t>1.000</w:t>
+            </w:r>
+          </w:p>
+        </w:tc>
+        <w:tc>
+          <w:tcPr>
+            <w:tcW w:type="dxa" w:w="1284"/>
+            <w:vAlign w:val="center"/>
+            <w:tcBorders>
+              <w:top w:val="single" w:sz="4" w:color="B9C2CC"/>
+              <w:left w:val="single" w:sz="4" w:color="B9C2CC"/>
+              <w:bottom w:val="single" w:sz="4" w:color="B9C2CC"/>
+              <w:right w:val="single" w:sz="4" w:color="B9C2CC"/>
+              <w:insideH w:val="single" w:sz="4" w:color="B9C2CC"/>
+              <w:insideV w:val="single" w:sz="4" w:color="B9C2CC"/>
+            </w:tcBorders>
+            <w:tcMar>
+              <w:top w:w="90" w:type="dxa"/>
+              <w:bottom w:w="90" w:type="dxa"/>
+              <w:start w:w="110" w:type="dxa"/>
+              <w:end w:w="110" w:type="dxa"/>
+            </w:tcMar>
+          </w:tcPr>
+          <w:p>
+            <w:pPr>
+              <w:spacing w:before="0" w:after="0" w:line="252" w:lineRule="auto"/>
+              <w:jc w:val="center"/>
+            </w:pPr>
+            <w:r>
+              <w:rPr>
+                <w:rFonts w:ascii="Arial" w:hAnsi="Arial"/>
+                <w:b w:val="0"/>
+                <w:color w:val="181B1F"/>
+                <w:sz w:val="16"/>
+              </w:rPr>
+              <w:t>1.000</w:t>
+            </w:r>
+          </w:p>
+        </w:tc>
+        <w:tc>
+          <w:tcPr>
+            <w:tcW w:type="dxa" w:w="1445"/>
+            <w:vAlign w:val="center"/>
+            <w:tcBorders>
+              <w:top w:val="single" w:sz="4" w:color="B9C2CC"/>
+              <w:left w:val="single" w:sz="4" w:color="B9C2CC"/>
+              <w:bottom w:val="single" w:sz="4" w:color="B9C2CC"/>
+              <w:right w:val="single" w:sz="4" w:color="B9C2CC"/>
+              <w:insideH w:val="single" w:sz="4" w:color="B9C2CC"/>
+              <w:insideV w:val="single" w:sz="4" w:color="B9C2CC"/>
+            </w:tcBorders>
+            <w:tcMar>
+              <w:top w:w="90" w:type="dxa"/>
+              <w:bottom w:w="90" w:type="dxa"/>
+              <w:start w:w="110" w:type="dxa"/>
+              <w:end w:w="110" w:type="dxa"/>
+            </w:tcMar>
+          </w:tcPr>
+          <w:p>
+            <w:pPr>
+              <w:spacing w:before="0" w:after="0" w:line="252" w:lineRule="auto"/>
+              <w:jc w:val="center"/>
+            </w:pPr>
+            <w:r>
+              <w:rPr>
+                <w:rFonts w:ascii="Arial" w:hAnsi="Arial"/>
+                <w:b w:val="0"/>
+                <w:color w:val="181B1F"/>
+                <w:sz w:val="16"/>
+              </w:rPr>
+              <w:t>1.000</w:t>
+            </w:r>
+          </w:p>
+        </w:tc>
+        <w:tc>
+          <w:tcPr>
+            <w:tcW w:type="dxa" w:w="2890"/>
+            <w:vAlign w:val="center"/>
+            <w:tcBorders>
+              <w:top w:val="single" w:sz="4" w:color="B9C2CC"/>
+              <w:left w:val="single" w:sz="4" w:color="B9C2CC"/>
+              <w:bottom w:val="single" w:sz="4" w:color="B9C2CC"/>
+              <w:right w:val="single" w:sz="4" w:color="B9C2CC"/>
+              <w:insideH w:val="single" w:sz="4" w:color="B9C2CC"/>
+              <w:insideV w:val="single" w:sz="4" w:color="B9C2CC"/>
+            </w:tcBorders>
+            <w:tcMar>
+              <w:top w:w="90" w:type="dxa"/>
+              <w:bottom w:w="90" w:type="dxa"/>
+              <w:start w:w="110" w:type="dxa"/>
+              <w:end w:w="110" w:type="dxa"/>
+            </w:tcMar>
+          </w:tcPr>
+          <w:p>
+            <w:pPr>
+              <w:spacing w:before="0" w:after="0" w:line="252" w:lineRule="auto"/>
+              <w:jc w:val="center"/>
+            </w:pPr>
+            <w:r>
+              <w:rPr>
+                <w:rFonts w:ascii="Arial" w:hAnsi="Arial"/>
+                <w:b w:val="0"/>
+                <w:color w:val="181B1F"/>
+                <w:sz w:val="16"/>
+              </w:rPr>
+              <w:t>0.000</w:t>
+            </w:r>
+          </w:p>
+        </w:tc>
+      </w:tr>
+    </w:tbl>
+    <w:p>
+      <w:pPr>
+        <w:spacing w:before="80" w:after="80"/>
+      </w:pPr>
+    </w:p>
+    <w:p>
+      <w:pPr>
+        <w:keepNext/>
+        <w:jc w:val="center"/>
+      </w:pPr>
+      <w:r>
+        <w:drawing>
+          <wp:inline xmlns:a="http://schemas.openxmlformats.org/drawingml/2006/main" xmlns:pic="http://schemas.openxmlformats.org/drawingml/2006/picture">
+            <wp:extent cx="5715000" cy="3333750"/>
+            <wp:docPr id="3" name="Picture 3" descr="Figure 3. Historical temporal rediscovery pilot across four ranking conditions." title="Figure 3"/>
+            <wp:cNvGraphicFramePr>
+              <a:graphicFrameLocks noChangeAspect="1"/>
+            </wp:cNvGraphicFramePr>
+            <a:graphic>
+              <a:graphicData uri="http://schemas.openxmlformats.org/drawingml/2006/picture">
+                <pic:pic>
+                  <pic:nvPicPr>
+                    <pic:cNvPr id="0" name="temporal_rediscovery.png"/>
+                    <pic:cNvPicPr/>
+                  </pic:nvPicPr>
+                  <pic:blipFill>
+                    <a:blip r:embed="rId13"/>
+                    <a:stretch>
+                      <a:fillRect/>
+                    </a:stretch>
+                  </pic:blipFill>
+                  <pic:spPr>
+                    <a:xfrm>
+                      <a:off x="0" y="0"/>
+                      <a:ext cx="5715000" cy="3333750"/>
+                    </a:xfrm>
+                    <a:prstGeom prst="rect"/>
+                  </pic:spPr>
+                </pic:pic>
+              </a:graphicData>
+            </a:graphic>
+          </wp:inline>
+        </w:drawing>
+      </w:r>
+    </w:p>
+    <w:p>
+      <w:pPr>
+        <w:pStyle w:val="Caption"/>
+      </w:pPr>
+      <w:r>
+        <w:rPr>
+          <w:rFonts w:ascii="Times New Roman" w:hAnsi="Times New Roman"/>
+          <w:color w:val="181B1F"/>
+          <w:sz w:val="22"/>
+        </w:rPr>
+        <w:t>Figure 3. Historical temporal rediscovery pilot across four ranking conditions.</w:t>
+      </w:r>
+    </w:p>
+    <w:p>
+      <w:pPr>
+        <w:pStyle w:val="Heading2"/>
+      </w:pPr>
+      <w:r>
+        <w:t>Original globin structural agreement</w:t>
+      </w:r>
+    </w:p>
+    <w:p>
+      <w:r>
+        <w:rPr>
+          <w:rFonts w:ascii="Times New Roman" w:hAnsi="Times New Roman"/>
+          <w:color w:val="181B1F"/>
+          <w:sz w:val="22"/>
+        </w:rPr>
+        <w:t>All three targets produced high sequence coverage and sub-ångström Cα RMSD after sequence-aware superposition (Table 3). Hemoglobin α had the lowest RMSD (0.270 Å), followed by myoglobin (0.501 Å) and hemoglobin β (0.520 Å). All matched α and β hemoglobin residues were within 2 Å of their experimental coordinates. For myoglobin, 146 of 147 matched residues (99.3%) were within 2 Å and all were within 5 Å.</w:t>
       </w:r>
     </w:p>
     <w:p>
@@ -3202,7 +4496,7 @@
         <w:drawing>
           <wp:inline xmlns:a="http://schemas.openxmlformats.org/drawingml/2006/main" xmlns:pic="http://schemas.openxmlformats.org/drawingml/2006/picture">
             <wp:extent cx="5715000" cy="3333750"/>
-            <wp:docPr id="3" name="Picture 3" descr="Figure 3. Cα RMSD for the three declared globin targets." title="Figure 3"/>
+            <wp:docPr id="4" name="Picture 4" descr="Figure 4. Cα RMSD for the three declared globin targets." title="Figure 4"/>
             <wp:cNvGraphicFramePr>
               <a:graphicFrameLocks noChangeAspect="1"/>
             </wp:cNvGraphicFramePr>
@@ -3214,7 +4508,7 @@
                     <pic:cNvPicPr/>
                   </pic:nvPicPr>
                   <pic:blipFill>
-                    <a:blip r:embed="rId13"/>
+                    <a:blip r:embed="rId14"/>
                     <a:stretch>
                       <a:fillRect/>
                     </a:stretch>
@@ -3243,7 +4537,7 @@
           <w:color w:val="181B1F"/>
           <w:sz w:val="22"/>
         </w:rPr>
-        <w:t>Figure 3. Cα RMSD for the three declared globin targets.</w:t>
+        <w:t>Figure 4. Cα RMSD for the three declared globin targets.</w:t>
       </w:r>
     </w:p>
     <w:p>
@@ -3264,8 +4558,8 @@
       <w:r>
         <w:drawing>
           <wp:inline xmlns:a="http://schemas.openxmlformats.org/drawingml/2006/main" xmlns:pic="http://schemas.openxmlformats.org/drawingml/2006/picture">
-            <wp:extent cx="5715000" cy="2032000"/>
-            <wp:docPr id="4" name="Picture 4" descr="Figure 4. Residue-level pLDDT versus aligned Cα error." title="Figure 4"/>
+            <wp:extent cx="5715000" cy="3707027"/>
+            <wp:docPr id="5" name="Picture 5" descr="Figure 5. Residue-level pLDDT versus aligned Cα error." title="Figure 5"/>
             <wp:cNvGraphicFramePr>
               <a:graphicFrameLocks noChangeAspect="1"/>
             </wp:cNvGraphicFramePr>
@@ -3277,7 +4571,7 @@
                     <pic:cNvPicPr/>
                   </pic:nvPicPr>
                   <pic:blipFill>
-                    <a:blip r:embed="rId14"/>
+                    <a:blip r:embed="rId15"/>
                     <a:stretch>
                       <a:fillRect/>
                     </a:stretch>
@@ -3285,7 +4579,7 @@
                   <pic:spPr>
                     <a:xfrm>
                       <a:off x="0" y="0"/>
-                      <a:ext cx="5715000" cy="2032000"/>
+                      <a:ext cx="5715000" cy="3707027"/>
                     </a:xfrm>
                     <a:prstGeom prst="rect"/>
                   </pic:spPr>
@@ -3306,7 +4600,98 @@
           <w:color w:val="181B1F"/>
           <w:sz w:val="22"/>
         </w:rPr>
-        <w:t>Figure 4. Residue-level pLDDT versus aligned Cα error.</w:t>
+        <w:t>Figure 5. Residue-level pLDDT versus aligned Cα error.</w:t>
+      </w:r>
+    </w:p>
+    <w:p>
+      <w:pPr>
+        <w:pStyle w:val="Heading2"/>
+      </w:pPr>
+      <w:r>
+        <w:t>Diverse structural screen and hypothesis triage</w:t>
+      </w:r>
+    </w:p>
+    <w:p>
+      <w:r>
+        <w:rPr>
+          <w:rFonts w:ascii="Times New Roman" w:hAnsi="Times New Roman"/>
+          <w:color w:val="181B1F"/>
+          <w:sz w:val="22"/>
+        </w:rPr>
+        <w:t>All 15 declared targets completed without retrieval or analysis failure. The panel contained 2,688 sequence-matched residues; median whole-chain RMSD was 0.520 Å and 9 of 15 targets were below 1 Å. After fitting only residues with pLDDT≥70, median core RMSD was 0.501 Å and 11 of 15 targets were below 1 Å (Figure 6). Compact proteins such as transthyretin, hemoglobin α, cytochrome c, superoxide dismutase 1, cyclophilin A, carbonic anhydrase 2, and lysozyme ranged from 0.258 to 0.420 Å in the high-confidence-core comparison. CDK2 and MAPK1 improved from whole-chain RMSDs of 1.873 and 1.705 Å to core values of 0.786 and 0.740 Å, respectively, indicating that lower-confidence regions dominated much of their global discrepancy.</w:t>
+      </w:r>
+    </w:p>
+    <w:p>
+      <w:r>
+        <w:rPr>
+          <w:rFonts w:ascii="Times New Roman" w:hAnsi="Times New Roman"/>
+          <w:color w:val="181B1F"/>
+          <w:sz w:val="22"/>
+        </w:rPr>
+        <w:t>Four targets retained high-confidence-core RMSD above 2 Å: KRAS (2.085 Å), SUMO1 (2.576 Å), TP53 (3.889 Å), and estrogen receptor α (4.961 Å). These comparisons differ in construct coverage, domain state, ligands, and experimental modality. SUMO1 is a solution-NMR ensemble with a flexible N-terminus; fitting the 74 high-confidence residues reduced its RMSD from 16.610 Å over the whole chain to 2.576 Å. TP53 and estrogen receptor α experimental chains cover only 49.4% and 40.0% of their respective full AlphaFold sequences. These facts make the high values informative triage signals but inadequate evidence of a novel conformation.</w:t>
+      </w:r>
+    </w:p>
+    <w:p>
+      <w:r>
+        <w:rPr>
+          <w:rFonts w:ascii="Times New Roman" w:hAnsi="Times New Roman"/>
+          <w:color w:val="181B1F"/>
+          <w:sz w:val="22"/>
+        </w:rPr>
+        <w:t>The predeclared rule emitted 27 high-confidence discrepancy regions, 9 containing at least two adjacent residues. The candidates are machine-readable and traceable to residue coordinates, but none is called a discovery. The most defensible immediate finding is methodological: confidence masking and experimental-context stratification prevent flexible termini and partial-domain constructs from dominating novelty screens, while retaining a short list for targeted structural review.</w:t>
+      </w:r>
+    </w:p>
+    <w:p>
+      <w:pPr>
+        <w:keepNext/>
+        <w:jc w:val="center"/>
+      </w:pPr>
+      <w:r>
+        <w:drawing>
+          <wp:inline xmlns:a="http://schemas.openxmlformats.org/drawingml/2006/main" xmlns:pic="http://schemas.openxmlformats.org/drawingml/2006/picture">
+            <wp:extent cx="5715000" cy="3857625"/>
+            <wp:docPr id="6" name="Picture 6" descr="Figure 6. High-confidence-core Cα RMSD across the declared 15-target structural panel." title="Figure 6"/>
+            <wp:cNvGraphicFramePr>
+              <a:graphicFrameLocks noChangeAspect="1"/>
+            </wp:cNvGraphicFramePr>
+            <a:graphic>
+              <a:graphicData uri="http://schemas.openxmlformats.org/drawingml/2006/picture">
+                <pic:pic>
+                  <pic:nvPicPr>
+                    <pic:cNvPr id="0" name="diverse_structure_panel_rmsd.png"/>
+                    <pic:cNvPicPr/>
+                  </pic:nvPicPr>
+                  <pic:blipFill>
+                    <a:blip r:embed="rId16"/>
+                    <a:stretch>
+                      <a:fillRect/>
+                    </a:stretch>
+                  </pic:blipFill>
+                  <pic:spPr>
+                    <a:xfrm>
+                      <a:off x="0" y="0"/>
+                      <a:ext cx="5715000" cy="3857625"/>
+                    </a:xfrm>
+                    <a:prstGeom prst="rect"/>
+                  </pic:spPr>
+                </pic:pic>
+              </a:graphicData>
+            </a:graphic>
+          </wp:inline>
+        </w:drawing>
+      </w:r>
+    </w:p>
+    <w:p>
+      <w:pPr>
+        <w:pStyle w:val="Caption"/>
+      </w:pPr>
+      <w:r>
+        <w:rPr>
+          <w:rFonts w:ascii="Times New Roman" w:hAnsi="Times New Roman"/>
+          <w:color w:val="181B1F"/>
+          <w:sz w:val="22"/>
+        </w:rPr>
+        <w:t>Figure 6. High-confidence-core Cα RMSD across the declared 15-target structural panel.</w:t>
       </w:r>
     </w:p>
     <w:p>
@@ -3324,7 +4709,7 @@
           <w:color w:val="181B1F"/>
           <w:sz w:val="22"/>
         </w:rPr>
-        <w:t>The case-study output contains the two experimental PDB files, three AlphaFold models, source and output hashes, a target-level CSV, a 433-row residue-level CSV, and a JSON manifest. Re-running the analysis reconstructs all summary values and Figures 3–4. A second script reconstructs Figures 1 and 2 from the repository architecture and validation JSON. The paper source, editable Word manuscript, and submission PDF are generated from the same controlled source bundle.</w:t>
+        <w:t>The evidence bundle contains the original globin inputs, 15-target panel declaration, 29 cached coordinate files for the diverse screen (15 AlphaFold models and 14 unique experimental PDB entries), source and output hashes, target- and residue-level CSV files, 27 discrepancy candidates, frozen temporal fixtures, complete candidate rankings, bootstrap summaries, and JSON manifests. The pinned CompBioBench catalog is stored separately from Plato-Bio results so imported task metadata cannot be mistaken for executed performance. Re-running the supplied scripts reconstructs the tables and Figures 3–6. The paper source, editable Word manuscript, LaTeX package, and submission PDFs are generated from the same controlled bundle.</w:t>
       </w:r>
     </w:p>
     <w:p>
@@ -3372,6 +4757,26 @@
           <w:color w:val="181B1F"/>
           <w:sz w:val="22"/>
         </w:rPr>
+        <w:t>The temporal pilot addresses a different question: whether a candidate relation can be reconstructed from literature that predates its direct evaluation. On the Raynaud task, generic frequency and lexical relevance favored known or more frequently mentioned concepts, whereas the independent evidence bridge recovered the held-out relation. The result is mechanistically interpretable because every score can be traced to PMID 58309 and PMID 4015748 and because direct pre-cutoff treatment records remain visible as known controls. This is a stronger novelty-screening contract than treating linguistic dissimilarity as novelty. It remains a retrospective case constructed with knowledge of the later literature, so prospective candidates must be reviewed against broader corpora and independently tested.</w:t>
+      </w:r>
+    </w:p>
+    <w:p>
+      <w:r>
+        <w:rPr>
+          <w:rFonts w:ascii="Times New Roman" w:hAnsi="Times New Roman"/>
+          <w:color w:val="181B1F"/>
+          <w:sz w:val="22"/>
+        </w:rPr>
+        <w:t>The 15-target screen shows why structural novelty triage needs confidence and context. Whole-chain RMSD can be dominated by disordered segments, while partial constructs and ligand-dependent states can produce legitimate high-confidence differences that are already known. Reporting both whole-chain and high-confidence-core values preserved these distinctions. The 27 emitted regions are therefore useful as an auditable review queue, not as 27 findings. A true structural novelty claim would require alternate-structure searches, construct and ligand matching, domain-aware or local scores, ensemble analysis, and ideally new experimental evidence.</w:t>
+      </w:r>
+    </w:p>
+    <w:p>
+      <w:r>
+        <w:rPr>
+          <w:rFonts w:ascii="Times New Roman" w:hAnsi="Times New Roman"/>
+          <w:color w:val="181B1F"/>
+          <w:sz w:val="22"/>
+        </w:rPr>
         <w:t>The source audit also changes how the agent itself should be described. The current default evaluation is an idea/method benchmark, not an end-to-end paper benchmark. The paper’s reviewer roles are same-model self-critique, not independent review. The autonomous loop infrastructure can keep or discard scored states, but its default adapters do not execute a full research cycle. These limitations are not wording details; they determine what can be concluded from future evaluations. A definitive efficacy study will require frozen biological tasks, versioned datasets, real results and paper generation, multiple stochastic repetitions, baseline/ablation conditions, and blinded domain-expert adjudication.</w:t>
       </w:r>
     </w:p>
@@ -3390,7 +4795,17 @@
           <w:color w:val="181B1F"/>
           <w:sz w:val="22"/>
         </w:rPr>
-        <w:t>The biological case study is intentionally small and does not include cryo-electron microscopy density fitting, lDDT, side-chain accuracy, ligand geometry, oligomeric interfaces, or conformational ensembles. PDB 3RGK is a K45R myoglobin mutant, and nonidentical aligned positions were excluded. Correlation tests are descriptive and unadjusted. Raw structures were retrieved from public services whose upstream records may be revised; file hashes freeze the exact analyzed bytes.</w:t>
+        <w:t>The temporal historical benchmark contains one manually curated task. Its bootstrap interval is necessarily degenerate, candidate concepts are not an exhaustive search space, concept annotations were curated with knowledge of the historical relation, and PubMed records outside the frozen set could change the rank or prior-art label. The five synthetic tasks are implementation fixtures. Generalization requires a preregistered set of many historical tasks curated by multiple experts with adjudicated cutoffs, broader frozen retrieval, harder decoys, and blinded evaluation. No prospective candidate was generated or experimentally validated.</w:t>
+      </w:r>
+    </w:p>
+    <w:p>
+      <w:r>
+        <w:rPr>
+          <w:rFonts w:ascii="Times New Roman" w:hAnsi="Times New Roman"/>
+          <w:color w:val="181B1F"/>
+          <w:sz w:val="22"/>
+        </w:rPr>
+        <w:t>The structural screen remains small and does not include cryo-electron microscopy density fitting, lDDT, TM-score, side-chain accuracy, ligand geometry, oligomeric interfaces, domain segmentation, or conformational-ensemble comparison. The high-confidence mask is based on AlphaFold pLDDT rather than an independently selected structural domain. PDB 3RGK is a K45R myoglobin mutant; 1A5R is an NMR ensemble represented by its first parsed model; and several PDB chains are partial constructs. Correlation tests and residue-bootstrap intervals are descriptive. Raw structures were retrieved from public services whose upstream records may be revised; file hashes freeze the exact analyzed bytes.</w:t>
       </w:r>
     </w:p>
     <w:p>
@@ -3428,7 +4843,23 @@
           <w:color w:val="181B1F"/>
           <w:sz w:val="22"/>
         </w:rPr>
-        <w:t>Plato-Bio provides a concrete, inspectable foundation for supervised computational-biology workflows: explicit graphs, biology-aware routing, typed genomics adapters, evidence and citation artifacts, consistency gates, and reproducibility records. The present audit and repairs improve the validity of future measurements, while the globin case study demonstrates an end-to-end reproducible computation with public inputs and machine-readable outputs. The current evidence supports software-contract and case-study reproducibility claims only. Establishing agent efficacy will require a larger preregistered biological benchmark, independent human assessment, and live end-to-end runs with complete provenance.</w:t>
+        <w:t xml:space="preserve">Plato-Bio provides an inspectable foundation for supervised computational-biology workflows and a more defensible route from retrieved literature or predicted structures to candidate hypotheses. Independent A–B/B–C evidence bridges outperformed frequency and TF–IDF in one historical rediscovery pilot, while confidence-masked structural comparison separated compact sub-ångström agreement from context-sensitive discrepancies across 15 proteins. The system now emits traceable candidates, known controls, abstentions, and explicit </w:t>
+      </w:r>
+      <w:r>
+        <w:rPr>
+          <w:rFonts w:ascii="Courier New" w:hAnsi="Courier New"/>
+          <w:color w:val="181B1F"/>
+          <w:sz w:val="19"/>
+        </w:rPr>
+        <w:t>not_established</w:t>
+      </w:r>
+      <w:r>
+        <w:rPr>
+          <w:rFonts w:ascii="Times New Roman" w:hAnsi="Times New Roman"/>
+          <w:color w:val="181B1F"/>
+          <w:sz w:val="22"/>
+        </w:rPr>
+        <w:t xml:space="preserve"> novelty labels instead of treating difference as discovery. The evidence supports software-contract reproducibility, one retrospective literature case, and descriptive structural triage. Establishing general agent efficacy or biological novelty still requires a larger preregistered benchmark, independent expert assessment, prospective analysis, and experimental validation.</w:t>
       </w:r>
     </w:p>
     <w:p>
@@ -3446,7 +4877,7 @@
           <w:color w:val="181B1F"/>
           <w:sz w:val="22"/>
         </w:rPr>
-        <w:t xml:space="preserve">Code, manuscript source, experiment scripts, exact input coordinate files, hashes, derived CSV files, figures, and validation JSON are available in the companion repository: </w:t>
+        <w:t xml:space="preserve">Code, manuscript source, experiment scripts, exact input coordinate files, hashes, derived CSV/JSONL files, figures, and validation manifests are available in the companion repository: </w:t>
       </w:r>
       <w:r>
         <w:rPr>
@@ -3471,7 +4902,7 @@
           <w:color w:val="181B1F"/>
           <w:sz w:val="22"/>
         </w:rPr>
-        <w:t xml:space="preserve"> The analyzed RCSB PDB entries are 1A3N and 3RGK. AlphaFold DB accessions are P69905, P68871, and P02144. Repository files under </w:t>
+        <w:t xml:space="preserve"> The original globin bundle is under </w:t>
       </w:r>
       <w:r>
         <w:rPr>
@@ -3487,7 +4918,71 @@
           <w:color w:val="181B1F"/>
           <w:sz w:val="22"/>
         </w:rPr>
-        <w:t xml:space="preserve"> freeze the exact analyzed inputs. The release commit identifier is recorded in the validation JSON and should be replaced by the final tagged release/archival DOI in a revision when available.</w:t>
+        <w:t xml:space="preserve">; the expanded structural screen is under </w:t>
+      </w:r>
+      <w:r>
+        <w:rPr>
+          <w:rFonts w:ascii="Courier New" w:hAnsi="Courier New"/>
+          <w:color w:val="181B1F"/>
+          <w:sz w:val="19"/>
+        </w:rPr>
+        <w:t>preprint/results/diverse_structure_benchmark/</w:t>
+      </w:r>
+      <w:r>
+        <w:rPr>
+          <w:rFonts w:ascii="Times New Roman" w:hAnsi="Times New Roman"/>
+          <w:color w:val="181B1F"/>
+          <w:sz w:val="22"/>
+        </w:rPr>
+        <w:t xml:space="preserve">; and temporal fixtures and results are under </w:t>
+      </w:r>
+      <w:r>
+        <w:rPr>
+          <w:rFonts w:ascii="Courier New" w:hAnsi="Courier New"/>
+          <w:color w:val="181B1F"/>
+          <w:sz w:val="19"/>
+        </w:rPr>
+        <w:t>evals/biological_novelty/fixtures/</w:t>
+      </w:r>
+      <w:r>
+        <w:rPr>
+          <w:rFonts w:ascii="Times New Roman" w:hAnsi="Times New Roman"/>
+          <w:color w:val="181B1F"/>
+          <w:sz w:val="22"/>
+        </w:rPr>
+        <w:t xml:space="preserve"> and </w:t>
+      </w:r>
+      <w:r>
+        <w:rPr>
+          <w:rFonts w:ascii="Courier New" w:hAnsi="Courier New"/>
+          <w:color w:val="181B1F"/>
+          <w:sz w:val="19"/>
+        </w:rPr>
+        <w:t>preprint/results/temporal_novelty_*</w:t>
+      </w:r>
+      <w:r>
+        <w:rPr>
+          <w:rFonts w:ascii="Times New Roman" w:hAnsi="Times New Roman"/>
+          <w:color w:val="181B1F"/>
+          <w:sz w:val="22"/>
+        </w:rPr>
+        <w:t xml:space="preserve">. The pinned, hash-verified CompBioBench catalog is metadata only and is stored under </w:t>
+      </w:r>
+      <w:r>
+        <w:rPr>
+          <w:rFonts w:ascii="Courier New" w:hAnsi="Courier New"/>
+          <w:color w:val="181B1F"/>
+          <w:sz w:val="19"/>
+        </w:rPr>
+        <w:t>preprint/results/compbiobench_catalog/</w:t>
+      </w:r>
+      <w:r>
+        <w:rPr>
+          <w:rFonts w:ascii="Times New Roman" w:hAnsi="Times New Roman"/>
+          <w:color w:val="181B1F"/>
+          <w:sz w:val="22"/>
+        </w:rPr>
+        <w:t>. The release commit identifier is recorded in validation manifests and should be replaced by a tagged release or archival DOI when available.</w:t>
       </w:r>
     </w:p>
     <w:p>
@@ -4118,6 +5613,312 @@
     </w:p>
     <w:p>
       <w:pPr>
+        <w:pStyle w:val="ListNumber"/>
+        <w:numPr>
+          <w:ilvl w:val="0"/>
+          <w:numId w:val="11"/>
+        </w:numPr>
+      </w:pPr>
+      <w:r>
+        <w:rPr>
+          <w:rFonts w:ascii="Times New Roman" w:hAnsi="Times New Roman"/>
+          <w:color w:val="181B1F"/>
+          <w:sz w:val="22"/>
+        </w:rPr>
+        <w:t xml:space="preserve"> </w:t>
+      </w:r>
+      <w:r>
+        <w:rPr>
+          <w:rFonts w:ascii="Times New Roman" w:hAnsi="Times New Roman"/>
+          <w:color w:val="181B1F"/>
+          <w:sz w:val="22"/>
+        </w:rPr>
+        <w:t xml:space="preserve">Chen Z, Chen S, Ning Y, et al. ScienceAgentBench: toward rigorous assessment of language agents for data-driven scientific discovery. </w:t>
+      </w:r>
+      <w:r>
+        <w:rPr>
+          <w:rFonts w:ascii="Times New Roman" w:hAnsi="Times New Roman"/>
+          <w:i/>
+          <w:color w:val="181B1F"/>
+          <w:sz w:val="22"/>
+        </w:rPr>
+        <w:t>International Conference on Learning Representations</w:t>
+      </w:r>
+      <w:r>
+        <w:rPr>
+          <w:rFonts w:ascii="Times New Roman" w:hAnsi="Times New Roman"/>
+          <w:color w:val="181B1F"/>
+          <w:sz w:val="22"/>
+        </w:rPr>
+        <w:t xml:space="preserve">. 2025. </w:t>
+      </w:r>
+      <w:r>
+        <w:rPr>
+          <w:rFonts w:ascii="Times New Roman" w:hAnsi="Times New Roman"/>
+          <w:color w:val="1F4D78"/>
+          <w:sz w:val="22"/>
+          <w:u w:val="single"/>
+        </w:rPr>
+        <w:t>https://proceedings.iclr.cc/paper_files/paper/2025/hash/f12b4df26344f3be803c06b555252efe-Abstract-Conference.html</w:t>
+      </w:r>
+    </w:p>
+    <w:p>
+      <w:pPr>
+        <w:pStyle w:val="ListNumber"/>
+        <w:numPr>
+          <w:ilvl w:val="0"/>
+          <w:numId w:val="11"/>
+        </w:numPr>
+      </w:pPr>
+      <w:r>
+        <w:rPr>
+          <w:rFonts w:ascii="Times New Roman" w:hAnsi="Times New Roman"/>
+          <w:color w:val="181B1F"/>
+          <w:sz w:val="22"/>
+        </w:rPr>
+        <w:t xml:space="preserve"> </w:t>
+      </w:r>
+      <w:r>
+        <w:rPr>
+          <w:rFonts w:ascii="Times New Roman" w:hAnsi="Times New Roman"/>
+          <w:color w:val="181B1F"/>
+          <w:sz w:val="22"/>
+        </w:rPr>
+        <w:t xml:space="preserve">Wang Z, Danek B, Sun J. BioDSA-1K: benchmarking data science agents for biomedical research. </w:t>
+      </w:r>
+      <w:r>
+        <w:rPr>
+          <w:rFonts w:ascii="Times New Roman" w:hAnsi="Times New Roman"/>
+          <w:i/>
+          <w:color w:val="181B1F"/>
+          <w:sz w:val="22"/>
+        </w:rPr>
+        <w:t>arXiv</w:t>
+      </w:r>
+      <w:r>
+        <w:rPr>
+          <w:rFonts w:ascii="Times New Roman" w:hAnsi="Times New Roman"/>
+          <w:color w:val="181B1F"/>
+          <w:sz w:val="22"/>
+        </w:rPr>
+        <w:t xml:space="preserve">. 2025. </w:t>
+      </w:r>
+      <w:r>
+        <w:rPr>
+          <w:rFonts w:ascii="Times New Roman" w:hAnsi="Times New Roman"/>
+          <w:color w:val="1F4D78"/>
+          <w:sz w:val="22"/>
+          <w:u w:val="single"/>
+        </w:rPr>
+        <w:t>https://doi.org/10.48550/arXiv.2505.16100</w:t>
+      </w:r>
+    </w:p>
+    <w:p>
+      <w:pPr>
+        <w:pStyle w:val="ListNumber"/>
+        <w:numPr>
+          <w:ilvl w:val="0"/>
+          <w:numId w:val="11"/>
+        </w:numPr>
+      </w:pPr>
+      <w:r>
+        <w:rPr>
+          <w:rFonts w:ascii="Times New Roman" w:hAnsi="Times New Roman"/>
+          <w:color w:val="181B1F"/>
+          <w:sz w:val="22"/>
+        </w:rPr>
+        <w:t xml:space="preserve"> </w:t>
+      </w:r>
+      <w:r>
+        <w:rPr>
+          <w:rFonts w:ascii="Times New Roman" w:hAnsi="Times New Roman"/>
+          <w:color w:val="181B1F"/>
+          <w:sz w:val="22"/>
+        </w:rPr>
+        <w:t xml:space="preserve">Mitchener L, Laurent JM, Andonian A, et al. BixBench: a comprehensive benchmark for LLM-based agents in computational biology. </w:t>
+      </w:r>
+      <w:r>
+        <w:rPr>
+          <w:rFonts w:ascii="Times New Roman" w:hAnsi="Times New Roman"/>
+          <w:i/>
+          <w:color w:val="181B1F"/>
+          <w:sz w:val="22"/>
+        </w:rPr>
+        <w:t>arXiv</w:t>
+      </w:r>
+      <w:r>
+        <w:rPr>
+          <w:rFonts w:ascii="Times New Roman" w:hAnsi="Times New Roman"/>
+          <w:color w:val="181B1F"/>
+          <w:sz w:val="22"/>
+        </w:rPr>
+        <w:t xml:space="preserve">. 2025. </w:t>
+      </w:r>
+      <w:r>
+        <w:rPr>
+          <w:rFonts w:ascii="Times New Roman" w:hAnsi="Times New Roman"/>
+          <w:color w:val="1F4D78"/>
+          <w:sz w:val="22"/>
+          <w:u w:val="single"/>
+        </w:rPr>
+        <w:t>https://doi.org/10.48550/arXiv.2503.00096</w:t>
+      </w:r>
+    </w:p>
+    <w:p>
+      <w:pPr>
+        <w:pStyle w:val="ListNumber"/>
+        <w:numPr>
+          <w:ilvl w:val="0"/>
+          <w:numId w:val="11"/>
+        </w:numPr>
+      </w:pPr>
+      <w:r>
+        <w:rPr>
+          <w:rFonts w:ascii="Times New Roman" w:hAnsi="Times New Roman"/>
+          <w:color w:val="181B1F"/>
+          <w:sz w:val="22"/>
+        </w:rPr>
+        <w:t xml:space="preserve"> </w:t>
+      </w:r>
+      <w:r>
+        <w:rPr>
+          <w:rFonts w:ascii="Times New Roman" w:hAnsi="Times New Roman"/>
+          <w:color w:val="181B1F"/>
+          <w:sz w:val="22"/>
+        </w:rPr>
+        <w:t xml:space="preserve">Goyle KB, Dormandy JA. Abnormal blood viscosity in Raynaud's phenomenon. </w:t>
+      </w:r>
+      <w:r>
+        <w:rPr>
+          <w:rFonts w:ascii="Times New Roman" w:hAnsi="Times New Roman"/>
+          <w:i/>
+          <w:color w:val="181B1F"/>
+          <w:sz w:val="22"/>
+        </w:rPr>
+        <w:t>Lancet</w:t>
+      </w:r>
+      <w:r>
+        <w:rPr>
+          <w:rFonts w:ascii="Times New Roman" w:hAnsi="Times New Roman"/>
+          <w:color w:val="181B1F"/>
+          <w:sz w:val="22"/>
+        </w:rPr>
+        <w:t xml:space="preserve">. 1976;1:1317–1318. </w:t>
+      </w:r>
+      <w:r>
+        <w:rPr>
+          <w:rFonts w:ascii="Times New Roman" w:hAnsi="Times New Roman"/>
+          <w:color w:val="1F4D78"/>
+          <w:sz w:val="22"/>
+          <w:u w:val="single"/>
+        </w:rPr>
+        <w:t>https://doi.org/10.1016/S0140-6736(76)92651-9</w:t>
+      </w:r>
+    </w:p>
+    <w:p>
+      <w:pPr>
+        <w:pStyle w:val="ListNumber"/>
+        <w:numPr>
+          <w:ilvl w:val="0"/>
+          <w:numId w:val="11"/>
+        </w:numPr>
+      </w:pPr>
+      <w:r>
+        <w:rPr>
+          <w:rFonts w:ascii="Times New Roman" w:hAnsi="Times New Roman"/>
+          <w:color w:val="181B1F"/>
+          <w:sz w:val="22"/>
+        </w:rPr>
+        <w:t xml:space="preserve"> </w:t>
+      </w:r>
+      <w:r>
+        <w:rPr>
+          <w:rFonts w:ascii="Times New Roman" w:hAnsi="Times New Roman"/>
+          <w:color w:val="181B1F"/>
+          <w:sz w:val="22"/>
+        </w:rPr>
+        <w:t xml:space="preserve">Cartwright IJ, Pockley AG, Galloway JH, Greaves M, Preston FE. The effects of dietary omega-3 polyunsaturated fatty acids on erythrocyte membrane phospholipids, erythrocyte deformability and blood viscosity in healthy volunteers. </w:t>
+      </w:r>
+      <w:r>
+        <w:rPr>
+          <w:rFonts w:ascii="Times New Roman" w:hAnsi="Times New Roman"/>
+          <w:i/>
+          <w:color w:val="181B1F"/>
+          <w:sz w:val="22"/>
+        </w:rPr>
+        <w:t>Atherosclerosis</w:t>
+      </w:r>
+      <w:r>
+        <w:rPr>
+          <w:rFonts w:ascii="Times New Roman" w:hAnsi="Times New Roman"/>
+          <w:color w:val="181B1F"/>
+          <w:sz w:val="22"/>
+        </w:rPr>
+        <w:t xml:space="preserve">. 1985;55:267–281. </w:t>
+      </w:r>
+      <w:r>
+        <w:rPr>
+          <w:rFonts w:ascii="Times New Roman" w:hAnsi="Times New Roman"/>
+          <w:color w:val="1F4D78"/>
+          <w:sz w:val="22"/>
+          <w:u w:val="single"/>
+        </w:rPr>
+        <w:t>https://doi.org/10.1016/0021-9150(85)90106-6</w:t>
+      </w:r>
+    </w:p>
+    <w:p>
+      <w:pPr>
+        <w:pStyle w:val="ListNumber"/>
+        <w:numPr>
+          <w:ilvl w:val="0"/>
+          <w:numId w:val="11"/>
+        </w:numPr>
+      </w:pPr>
+      <w:r>
+        <w:rPr>
+          <w:rFonts w:ascii="Times New Roman" w:hAnsi="Times New Roman"/>
+          <w:color w:val="181B1F"/>
+          <w:sz w:val="22"/>
+        </w:rPr>
+        <w:t xml:space="preserve"> </w:t>
+      </w:r>
+      <w:r>
+        <w:rPr>
+          <w:rFonts w:ascii="Times New Roman" w:hAnsi="Times New Roman"/>
+          <w:color w:val="181B1F"/>
+          <w:sz w:val="22"/>
+        </w:rPr>
+        <w:t xml:space="preserve">DiGiacomo RA, Kremer JM, Shah DM. Fish-oil dietary supplementation in patients with Raynaud's phenomenon: a double-blind, controlled, prospective study. </w:t>
+      </w:r>
+      <w:r>
+        <w:rPr>
+          <w:rFonts w:ascii="Times New Roman" w:hAnsi="Times New Roman"/>
+          <w:i/>
+          <w:color w:val="181B1F"/>
+          <w:sz w:val="22"/>
+        </w:rPr>
+        <w:t>American Journal of Medicine</w:t>
+      </w:r>
+      <w:r>
+        <w:rPr>
+          <w:rFonts w:ascii="Times New Roman" w:hAnsi="Times New Roman"/>
+          <w:color w:val="181B1F"/>
+          <w:sz w:val="22"/>
+        </w:rPr>
+        <w:t xml:space="preserve">. 1989;86:158–164. </w:t>
+      </w:r>
+      <w:r>
+        <w:rPr>
+          <w:rFonts w:ascii="Times New Roman" w:hAnsi="Times New Roman"/>
+          <w:color w:val="1F4D78"/>
+          <w:sz w:val="22"/>
+          <w:u w:val="single"/>
+        </w:rPr>
+        <w:t>https://doi.org/10.1016/0002-9343(89)90261-1</w:t>
+      </w:r>
+    </w:p>
+    <w:p>
+      <w:pPr>
         <w:pStyle w:val="Heading1"/>
       </w:pPr>
       <w:r>
@@ -4170,7 +5971,26 @@
           <w:color w:val="181B1F"/>
           <w:sz w:val="22"/>
         </w:rPr>
-        <w:t>Figure 3. AlphaFold-to-experiment agreement in the declared globin panel.</w:t>
+        <w:t>Figure 3. Historical temporal rediscovery pilot.</w:t>
+      </w:r>
+      <w:r>
+        <w:rPr>
+          <w:rFonts w:ascii="Times New Roman" w:hAnsi="Times New Roman"/>
+          <w:color w:val="181B1F"/>
+          <w:sz w:val="22"/>
+        </w:rPr>
+        <w:t xml:space="preserve"> Bars compare mean reciprocal rank and Recall@1 for frequency, TF–IDF, A–B/B–C bridge, and evidence-aware ranking. The benchmark contains one manually curated task, so the values are descriptive and do not estimate general discovery performance.</w:t>
+      </w:r>
+    </w:p>
+    <w:p>
+      <w:r>
+        <w:rPr>
+          <w:rFonts w:ascii="Times New Roman" w:hAnsi="Times New Roman"/>
+          <w:b/>
+          <w:color w:val="181B1F"/>
+          <w:sz w:val="22"/>
+        </w:rPr>
+        <w:t>Figure 4. AlphaFold-to-experiment agreement in the declared globin panel.</w:t>
       </w:r>
       <w:r>
         <w:rPr>
@@ -4189,7 +6009,7 @@
           <w:color w:val="181B1F"/>
           <w:sz w:val="22"/>
         </w:rPr>
-        <w:t>Figure 4. Residue confidence versus aligned coordinate error.</w:t>
+        <w:t>Figure 5. Residue confidence versus aligned coordinate error.</w:t>
       </w:r>
       <w:r>
         <w:rPr>
@@ -4198,6 +6018,25 @@
           <w:sz w:val="22"/>
         </w:rPr>
         <w:t xml:space="preserve"> Each point is one matched residue. pLDDT is read from the AlphaFold PDB B-factor field; error is the Euclidean Cα distance after target-level superposition.</w:t>
+      </w:r>
+    </w:p>
+    <w:p>
+      <w:r>
+        <w:rPr>
+          <w:rFonts w:ascii="Times New Roman" w:hAnsi="Times New Roman"/>
+          <w:b/>
+          <w:color w:val="181B1F"/>
+          <w:sz w:val="22"/>
+        </w:rPr>
+        <w:t>Figure 6. Diverse structural screen.</w:t>
+      </w:r>
+      <w:r>
+        <w:rPr>
+          <w:rFonts w:ascii="Times New Roman" w:hAnsi="Times New Roman"/>
+          <w:color w:val="181B1F"/>
+          <w:sz w:val="22"/>
+        </w:rPr>
+        <w:t xml:space="preserve"> Bars show Cα RMSD after Kabsch fitting on matched AlphaFold residues with pLDDT≥70. Error bars are descriptive 95% moving-block residue-bootstrap intervals and are not population-level confidence intervals.</w:t>
       </w:r>
     </w:p>
     <w:sectPr>

</xml_diff>